<commit_message>
Regenerate docx files with updated Goose/MCP documentation
</commit_message>
<xml_diff>
--- a/README.docx
+++ b/README.docx
@@ -4,128 +4,120 @@
   <w:body>
     <w:p>
       <w:pPr>
-        <w:pStyle w:val="Title"/>
-        <w:jc w:val="center"/>
+        <w:pStyle w:val="Heading1"/>
       </w:pPr>
       <w:r>
         <w:t>EqualTales #75HER</w:t>
       </w:r>
     </w:p>
+    <w:p/>
     <w:p>
-      <w:pPr>
-        <w:jc w:val="center"/>
-      </w:pPr>
       <w:r>
-        <w:rPr>
-          <w:b/>
-        </w:rPr>
-        <w:t>Mothers of children ages 3–10</w:t>
-      </w:r>
-      <w:r>
-        <w:t xml:space="preserve"> get a </w:t>
-      </w:r>
-      <w:r>
-        <w:rPr>
-          <w:b/>
-        </w:rPr>
-        <w:t>personalized, illustrated anti-stereotype story</w:t>
-      </w:r>
-      <w:r>
-        <w:t xml:space="preserve"> in </w:t>
-      </w:r>
-      <w:r>
-        <w:rPr>
-          <w:b/>
-        </w:rPr>
-        <w:t>under 90 seconds</w:t>
-      </w:r>
-      <w:r>
-        <w:t xml:space="preserve"> — featuring real women who broke barriers.</w:t>
+        <w:t>Mothers of children ages 3–10 get a personalized, illustrated anti-stereotype story in under 90 seconds — featuring real women who broke barriers.</w:t>
       </w:r>
     </w:p>
+    <w:p/>
     <w:p>
-      <w:pPr>
-        <w:pStyle w:val="Heading1"/>
-      </w:pPr>
       <w:r>
-        <w:t>Problem Statement</w:t>
+        <w:t>──────────────────────────────────────────────────</w:t>
       </w:r>
     </w:p>
+    <w:p/>
     <w:p>
       <w:pPr>
         <w:pStyle w:val="Heading2"/>
       </w:pPr>
       <w:r>
-        <w:t>Who</w:t>
+        <w:t>Quickstart (1-Command Setup)</w:t>
+      </w:r>
+    </w:p>
+    <w:p/>
+    <w:p>
+      <w:pPr/>
+      <w:r>
+        <w:rPr>
+          <w:rFonts w:ascii="Courier New" w:hAnsi="Courier New"/>
+          <w:sz w:val="18"/>
+        </w:rPr>
+        <w:t># Clone and run (requires Python 3.10+, Node.js 18+)</w:t>
+        <w:br/>
+        <w:t>git clone https://github.com/hafsau/EqualTales.git &amp;&amp; cd EqualTales &amp;&amp; \</w:t>
+        <w:br/>
+        <w:t>cp .env.example .env &amp;&amp; \</w:t>
+        <w:br/>
+        <w:t>echo "Add your API keys to .env, then run:" &amp;&amp; \</w:t>
+        <w:br/>
+        <w:t>echo "Terminal 1: cd backend &amp;&amp; pip install -r requirements.txt &amp;&amp; python3 app.py" &amp;&amp; \</w:t>
+        <w:br/>
+        <w:t>echo "Terminal 2: cd frontend &amp;&amp; npm install &amp;&amp; npm start"</w:t>
+      </w:r>
+    </w:p>
+    <w:p/>
+    <w:p>
+      <w:pPr>
+        <w:pStyle w:val="Heading3"/>
+      </w:pPr>
+      <w:r>
+        <w:t>.env.example</w:t>
       </w:r>
     </w:p>
     <w:p>
+      <w:pPr/>
       <w:r>
-        <w:t>Mothers of children ages 3–10 who want to counter gender stereotypes their children are absorbing.</w:t>
+        <w:rPr>
+          <w:rFonts w:ascii="Courier New" w:hAnsi="Courier New"/>
+          <w:sz w:val="18"/>
+        </w:rPr>
+        <w:t>OPENROUTER_API_KEY=sk-or-your-key-here</w:t>
+        <w:br/>
+        <w:t>OPENAI_API_KEY=sk-proj-your-key-here</w:t>
       </w:r>
     </w:p>
+    <w:p/>
+    <w:p>
+      <w:r>
+        <w:t>Open http://localhost:3000 → Click "Try It Now" → Select a stereotype → Generate!</w:t>
+      </w:r>
+    </w:p>
+    <w:p/>
+    <w:p>
+      <w:r>
+        <w:t>──────────────────────────────────────────────────</w:t>
+      </w:r>
+    </w:p>
+    <w:p/>
     <w:p>
       <w:pPr>
         <w:pStyle w:val="Heading2"/>
       </w:pPr>
       <w:r>
-        <w:t>Problem</w:t>
+        <w:t>Project Overview</w:t>
+      </w:r>
+    </w:p>
+    <w:p/>
+    <w:p>
+      <w:pPr>
+        <w:pStyle w:val="Heading3"/>
+      </w:pPr>
+      <w:r>
+        <w:t>What It Does</w:t>
       </w:r>
     </w:p>
     <w:p>
       <w:r>
-        <w:t>Children internalize gender stereotypes by age 3. By age 6, girls start believing boys are inherently "smarter." Existing counter-stereotype content is either:</w:t>
+        <w:t>EqualTales generates personalized, illustrated children's stories that counter specific gender stereotypes. A mother inputs a stereotype (e.g., "Girls can't do math"), her child's name and age, and receives a 5-page illustrated storybook featuring a real woman who proved the stereotype wrong.</w:t>
       </w:r>
     </w:p>
+    <w:p/>
     <w:p>
+      <w:pPr>
+        <w:pStyle w:val="Heading3"/>
+      </w:pPr>
       <w:r>
-        <w:t>• Generic ("girls can do anything!") — too vague to address specific beliefs</w:t>
+        <w:t>Tech Stack</w:t>
       </w:r>
     </w:p>
-    <w:p>
-      <w:r>
-        <w:t>• Biographical — disconnected from the child's personal experience</w:t>
-      </w:r>
-    </w:p>
-    <w:p>
-      <w:pPr>
-        <w:pStyle w:val="Heading2"/>
-      </w:pPr>
-      <w:r>
-        <w:t>Impact</w:t>
-      </w:r>
-    </w:p>
-    <w:p>
-      <w:r>
-        <w:t>Early stereotypes shape career aspirations, self-confidence, and life choices. Without targeted intervention, these beliefs become deeply ingrained.</w:t>
-      </w:r>
-    </w:p>
-    <w:p>
-      <w:pPr>
-        <w:pStyle w:val="Heading1"/>
-      </w:pPr>
-      <w:r>
-        <w:t>Solution Overview</w:t>
-      </w:r>
-    </w:p>
-    <w:p>
-      <w:r>
-        <w:t>EqualTales is an AI-powered web application that generates personalized, illustrated children's stories designed to counter specific gender stereotypes.</w:t>
-      </w:r>
-    </w:p>
-    <w:p>
-      <w:r>
-        <w:t>A mother types the stereotype her child expressed (e.g., "my daughter thinks math is for boys"), enters the child's name and age, and receives a complete 5-page illustrated storybook where a fictional child discovers a real woman who proved the stereotype wrong.</w:t>
-      </w:r>
-    </w:p>
-    <w:p>
-      <w:pPr>
-        <w:pStyle w:val="Heading2"/>
-      </w:pPr>
-      <w:r>
-        <w:t>Key Features</w:t>
-      </w:r>
-    </w:p>
+    <w:p/>
     <w:tbl>
       <w:tblPr>
         <w:tblStyle w:val="TableGrid"/>
@@ -141,54 +133,10 @@
         <w:tc>
           <w:tcPr>
             <w:tcW w:type="dxa" w:w="2880"/>
-            <w:shd w:fill="D9EAD3"/>
           </w:tcPr>
           <w:p>
             <w:r>
-              <w:rPr>
-                <w:b/>
-              </w:rPr>
-              <w:t>Feature</w:t>
-            </w:r>
-          </w:p>
-        </w:tc>
-        <w:tc>
-          <w:tcPr>
-            <w:tcW w:type="dxa" w:w="2880"/>
-            <w:shd w:fill="D9EAD3"/>
-          </w:tcPr>
-          <w:p>
-            <w:r>
-              <w:rPr>
-                <w:b/>
-              </w:rPr>
-              <w:t>Description</w:t>
-            </w:r>
-          </w:p>
-        </w:tc>
-        <w:tc>
-          <w:tcPr>
-            <w:tcW w:type="dxa" w:w="2880"/>
-            <w:shd w:fill="D9EAD3"/>
-          </w:tcPr>
-          <w:p>
-            <w:r>
-              <w:rPr>
-                <w:b/>
-              </w:rPr>
-              <w:t>Why It Matters</w:t>
-            </w:r>
-          </w:p>
-        </w:tc>
-      </w:tr>
-      <w:tr>
-        <w:tc>
-          <w:tcPr>
-            <w:tcW w:type="dxa" w:w="2880"/>
-          </w:tcPr>
-          <w:p>
-            <w:r>
-              <w:t>Personalized Stories</w:t>
+              <w:t>Component</w:t>
             </w:r>
           </w:p>
         </w:tc>
@@ -198,7 +146,7 @@
           </w:tcPr>
           <w:p>
             <w:r>
-              <w:t>Child's name becomes the protagonist</w:t>
+              <w:t>Technology</w:t>
             </w:r>
           </w:p>
         </w:tc>
@@ -208,652 +156,6 @@
           </w:tcPr>
           <w:p>
             <w:r>
-              <w:t>Creates personal connection and identification</w:t>
-            </w:r>
-          </w:p>
-        </w:tc>
-      </w:tr>
-      <w:tr>
-        <w:tc>
-          <w:tcPr>
-            <w:tcW w:type="dxa" w:w="2880"/>
-          </w:tcPr>
-          <w:p>
-            <w:r>
-              <w:t>Real Women Integration</w:t>
-            </w:r>
-          </w:p>
-        </w:tc>
-        <w:tc>
-          <w:tcPr>
-            <w:tcW w:type="dxa" w:w="2880"/>
-          </w:tcPr>
-          <w:p>
-            <w:r>
-              <w:t>50 historical women matched to stereotypes</w:t>
-            </w:r>
-          </w:p>
-        </w:tc>
-        <w:tc>
-          <w:tcPr>
-            <w:tcW w:type="dxa" w:w="2880"/>
-          </w:tcPr>
-          <w:p>
-            <w:r>
-              <w:t>Provides concrete proof, not abstract affirmation</w:t>
-            </w:r>
-          </w:p>
-        </w:tc>
-      </w:tr>
-      <w:tr>
-        <w:tc>
-          <w:tcPr>
-            <w:tcW w:type="dxa" w:w="2880"/>
-          </w:tcPr>
-          <w:p>
-            <w:r>
-              <w:t>Age-Adaptive Content</w:t>
-            </w:r>
-          </w:p>
-        </w:tc>
-        <w:tc>
-          <w:tcPr>
-            <w:tcW w:type="dxa" w:w="2880"/>
-          </w:tcPr>
-          <w:p>
-            <w:r>
-              <w:t>Stories adjust for ages 3-5, 6-8, 9-10</w:t>
-            </w:r>
-          </w:p>
-        </w:tc>
-        <w:tc>
-          <w:tcPr>
-            <w:tcW w:type="dxa" w:w="2880"/>
-          </w:tcPr>
-          <w:p>
-            <w:r>
-              <w:t>Appropriate vocabulary and complexity</w:t>
-            </w:r>
-          </w:p>
-        </w:tc>
-      </w:tr>
-      <w:tr>
-        <w:tc>
-          <w:tcPr>
-            <w:tcW w:type="dxa" w:w="2880"/>
-          </w:tcPr>
-          <w:p>
-            <w:r>
-              <w:t>QA Verification</w:t>
-            </w:r>
-          </w:p>
-        </w:tc>
-        <w:tc>
-          <w:tcPr>
-            <w:tcW w:type="dxa" w:w="2880"/>
-          </w:tcPr>
-          <w:p>
-            <w:r>
-              <w:t>AI checks for stereotype reinforcement</w:t>
-            </w:r>
-          </w:p>
-        </w:tc>
-        <w:tc>
-          <w:tcPr>
-            <w:tcW w:type="dxa" w:w="2880"/>
-          </w:tcPr>
-          <w:p>
-            <w:r>
-              <w:t>Ensures stories don't amplify the bias they counter</w:t>
-            </w:r>
-          </w:p>
-        </w:tc>
-      </w:tr>
-      <w:tr>
-        <w:tc>
-          <w:tcPr>
-            <w:tcW w:type="dxa" w:w="2880"/>
-          </w:tcPr>
-          <w:p>
-            <w:r>
-              <w:t>Illustrated Pages</w:t>
-            </w:r>
-          </w:p>
-        </w:tc>
-        <w:tc>
-          <w:tcPr>
-            <w:tcW w:type="dxa" w:w="2880"/>
-          </w:tcPr>
-          <w:p>
-            <w:r>
-              <w:t>5 DALL-E 3 watercolor illustrations</w:t>
-            </w:r>
-          </w:p>
-        </w:tc>
-        <w:tc>
-          <w:tcPr>
-            <w:tcW w:type="dxa" w:w="2880"/>
-          </w:tcPr>
-          <w:p>
-            <w:r>
-              <w:t>Engaging visual storytelling experience</w:t>
-            </w:r>
-          </w:p>
-        </w:tc>
-      </w:tr>
-    </w:tbl>
-    <w:p>
-      <w:pPr>
-        <w:pStyle w:val="Heading1"/>
-      </w:pPr>
-      <w:r>
-        <w:t>Quick Start &amp; Demo Path</w:t>
-      </w:r>
-    </w:p>
-    <w:p>
-      <w:pPr>
-        <w:pStyle w:val="Heading2"/>
-      </w:pPr>
-      <w:r>
-        <w:t>Requirements</w:t>
-      </w:r>
-    </w:p>
-    <w:p>
-      <w:r>
-        <w:t>• Python 3.10+</w:t>
-      </w:r>
-    </w:p>
-    <w:p>
-      <w:r>
-        <w:t>• Node.js 18+</w:t>
-      </w:r>
-    </w:p>
-    <w:p>
-      <w:r>
-        <w:t>• OpenRouter API key ($80 sponsored credits)</w:t>
-      </w:r>
-    </w:p>
-    <w:p>
-      <w:r>
-        <w:t>• OpenAI API key (for DALL-E 3)</w:t>
-      </w:r>
-    </w:p>
-    <w:p>
-      <w:pPr>
-        <w:pStyle w:val="Heading2"/>
-      </w:pPr>
-      <w:r>
-        <w:t>Installation</w:t>
-      </w:r>
-    </w:p>
-    <w:p>
-      <w:r>
-        <w:t># Clone repository</w:t>
-      </w:r>
-    </w:p>
-    <w:p>
-      <w:r>
-        <w:t>git clone https://github.com/[your-username]/EqualTales.git</w:t>
-      </w:r>
-    </w:p>
-    <w:p>
-      <w:r>
-        <w:t>cd EqualTales</w:t>
-      </w:r>
-    </w:p>
-    <w:p/>
-    <w:p>
-      <w:r>
-        <w:t># Backend setup</w:t>
-      </w:r>
-    </w:p>
-    <w:p>
-      <w:r>
-        <w:t>cd backend &amp;&amp; pip install -r requirements.txt</w:t>
-      </w:r>
-    </w:p>
-    <w:p>
-      <w:r>
-        <w:t>cp ../.env.example ../.env  # Add your API keys</w:t>
-      </w:r>
-    </w:p>
-    <w:p/>
-    <w:p>
-      <w:r>
-        <w:t># Frontend setup</w:t>
-      </w:r>
-    </w:p>
-    <w:p>
-      <w:r>
-        <w:t>cd ../frontend &amp;&amp; npm install</w:t>
-      </w:r>
-    </w:p>
-    <w:p/>
-    <w:p>
-      <w:r>
-        <w:t># Run both</w:t>
-      </w:r>
-    </w:p>
-    <w:p>
-      <w:r>
-        <w:t>cd backend &amp;&amp; python3 app.py      # http://localhost:5001</w:t>
-      </w:r>
-    </w:p>
-    <w:p>
-      <w:r>
-        <w:t>cd frontend &amp;&amp; npm start          # http://localhost:3000</w:t>
-      </w:r>
-    </w:p>
-    <w:p>
-      <w:pPr>
-        <w:pStyle w:val="Heading2"/>
-      </w:pPr>
-      <w:r>
-        <w:t>60-Second Demo Path</w:t>
-      </w:r>
-    </w:p>
-    <w:tbl>
-      <w:tblPr>
-        <w:tblStyle w:val="TableGrid"/>
-        <w:tblW w:type="auto" w:w="0"/>
-        <w:tblLook w:firstColumn="1" w:firstRow="1" w:lastColumn="0" w:lastRow="0" w:noHBand="0" w:noVBand="1" w:val="04A0"/>
-      </w:tblPr>
-      <w:tblGrid>
-        <w:gridCol w:w="2880"/>
-        <w:gridCol w:w="2880"/>
-        <w:gridCol w:w="2880"/>
-      </w:tblGrid>
-      <w:tr>
-        <w:tc>
-          <w:tcPr>
-            <w:tcW w:type="dxa" w:w="2880"/>
-            <w:shd w:fill="D9EAD3"/>
-          </w:tcPr>
-          <w:p>
-            <w:r>
-              <w:rPr>
-                <w:b/>
-              </w:rPr>
-              <w:t>Step</w:t>
-            </w:r>
-          </w:p>
-        </w:tc>
-        <w:tc>
-          <w:tcPr>
-            <w:tcW w:type="dxa" w:w="2880"/>
-            <w:shd w:fill="D9EAD3"/>
-          </w:tcPr>
-          <w:p>
-            <w:r>
-              <w:rPr>
-                <w:b/>
-              </w:rPr>
-              <w:t>Action</w:t>
-            </w:r>
-          </w:p>
-        </w:tc>
-        <w:tc>
-          <w:tcPr>
-            <w:tcW w:type="dxa" w:w="2880"/>
-            <w:shd w:fill="D9EAD3"/>
-          </w:tcPr>
-          <w:p>
-            <w:r>
-              <w:rPr>
-                <w:b/>
-              </w:rPr>
-              <w:t>Expected Result</w:t>
-            </w:r>
-          </w:p>
-        </w:tc>
-      </w:tr>
-      <w:tr>
-        <w:tc>
-          <w:tcPr>
-            <w:tcW w:type="dxa" w:w="2880"/>
-          </w:tcPr>
-          <w:p>
-            <w:r>
-              <w:t>1</w:t>
-            </w:r>
-          </w:p>
-        </w:tc>
-        <w:tc>
-          <w:tcPr>
-            <w:tcW w:type="dxa" w:w="2880"/>
-          </w:tcPr>
-          <w:p>
-            <w:r>
-              <w:t>Open http://localhost:3000</w:t>
-            </w:r>
-          </w:p>
-        </w:tc>
-        <w:tc>
-          <w:tcPr>
-            <w:tcW w:type="dxa" w:w="2880"/>
-          </w:tcPr>
-          <w:p>
-            <w:r>
-              <w:t>Landing page with "Try It Now" button</w:t>
-            </w:r>
-          </w:p>
-        </w:tc>
-      </w:tr>
-      <w:tr>
-        <w:tc>
-          <w:tcPr>
-            <w:tcW w:type="dxa" w:w="2880"/>
-          </w:tcPr>
-          <w:p>
-            <w:r>
-              <w:t>2</w:t>
-            </w:r>
-          </w:p>
-        </w:tc>
-        <w:tc>
-          <w:tcPr>
-            <w:tcW w:type="dxa" w:w="2880"/>
-          </w:tcPr>
-          <w:p>
-            <w:r>
-              <w:t>Click "Try It Now"</w:t>
-            </w:r>
-          </w:p>
-        </w:tc>
-        <w:tc>
-          <w:tcPr>
-            <w:tcW w:type="dxa" w:w="2880"/>
-          </w:tcPr>
-          <w:p>
-            <w:r>
-              <w:t>Input form appears</w:t>
-            </w:r>
-          </w:p>
-        </w:tc>
-      </w:tr>
-      <w:tr>
-        <w:tc>
-          <w:tcPr>
-            <w:tcW w:type="dxa" w:w="2880"/>
-          </w:tcPr>
-          <w:p>
-            <w:r>
-              <w:t>3</w:t>
-            </w:r>
-          </w:p>
-        </w:tc>
-        <w:tc>
-          <w:tcPr>
-            <w:tcW w:type="dxa" w:w="2880"/>
-          </w:tcPr>
-          <w:p>
-            <w:r>
-              <w:t>Click "Girls can't do math" example</w:t>
-            </w:r>
-          </w:p>
-        </w:tc>
-        <w:tc>
-          <w:tcPr>
-            <w:tcW w:type="dxa" w:w="2880"/>
-          </w:tcPr>
-          <w:p>
-            <w:r>
-              <w:t>Stereotype text fills in</w:t>
-            </w:r>
-          </w:p>
-        </w:tc>
-      </w:tr>
-      <w:tr>
-        <w:tc>
-          <w:tcPr>
-            <w:tcW w:type="dxa" w:w="2880"/>
-          </w:tcPr>
-          <w:p>
-            <w:r>
-              <w:t>4</w:t>
-            </w:r>
-          </w:p>
-        </w:tc>
-        <w:tc>
-          <w:tcPr>
-            <w:tcW w:type="dxa" w:w="2880"/>
-          </w:tcPr>
-          <w:p>
-            <w:r>
-              <w:t>Enter child's name: "Lily"</w:t>
-            </w:r>
-          </w:p>
-        </w:tc>
-        <w:tc>
-          <w:tcPr>
-            <w:tcW w:type="dxa" w:w="2880"/>
-          </w:tcPr>
-          <w:p>
-            <w:r>
-              <w:t>Name field populated</w:t>
-            </w:r>
-          </w:p>
-        </w:tc>
-      </w:tr>
-      <w:tr>
-        <w:tc>
-          <w:tcPr>
-            <w:tcW w:type="dxa" w:w="2880"/>
-          </w:tcPr>
-          <w:p>
-            <w:r>
-              <w:t>5</w:t>
-            </w:r>
-          </w:p>
-        </w:tc>
-        <w:tc>
-          <w:tcPr>
-            <w:tcW w:type="dxa" w:w="2880"/>
-          </w:tcPr>
-          <w:p>
-            <w:r>
-              <w:t>Set age slider to 6</w:t>
-            </w:r>
-          </w:p>
-        </w:tc>
-        <w:tc>
-          <w:tcPr>
-            <w:tcW w:type="dxa" w:w="2880"/>
-          </w:tcPr>
-          <w:p>
-            <w:r>
-              <w:t>Age selected</w:t>
-            </w:r>
-          </w:p>
-        </w:tc>
-      </w:tr>
-      <w:tr>
-        <w:tc>
-          <w:tcPr>
-            <w:tcW w:type="dxa" w:w="2880"/>
-          </w:tcPr>
-          <w:p>
-            <w:r>
-              <w:t>6</w:t>
-            </w:r>
-          </w:p>
-        </w:tc>
-        <w:tc>
-          <w:tcPr>
-            <w:tcW w:type="dxa" w:w="2880"/>
-          </w:tcPr>
-          <w:p>
-            <w:r>
-              <w:t>Click "Create My Story"</w:t>
-            </w:r>
-          </w:p>
-        </w:tc>
-        <w:tc>
-          <w:tcPr>
-            <w:tcW w:type="dxa" w:w="2880"/>
-          </w:tcPr>
-          <w:p>
-            <w:r>
-              <w:t>Progress screen with steps</w:t>
-            </w:r>
-          </w:p>
-        </w:tc>
-      </w:tr>
-      <w:tr>
-        <w:tc>
-          <w:tcPr>
-            <w:tcW w:type="dxa" w:w="2880"/>
-          </w:tcPr>
-          <w:p>
-            <w:r>
-              <w:t>7</w:t>
-            </w:r>
-          </w:p>
-        </w:tc>
-        <w:tc>
-          <w:tcPr>
-            <w:tcW w:type="dxa" w:w="2880"/>
-          </w:tcPr>
-          <w:p>
-            <w:r>
-              <w:t>Watch generation (~75 seconds)</w:t>
-            </w:r>
-          </w:p>
-        </w:tc>
-        <w:tc>
-          <w:tcPr>
-            <w:tcW w:type="dxa" w:w="2880"/>
-          </w:tcPr>
-          <w:p>
-            <w:r>
-              <w:t>See "Featuring Katherine Johnson" reveal</w:t>
-            </w:r>
-          </w:p>
-        </w:tc>
-      </w:tr>
-      <w:tr>
-        <w:tc>
-          <w:tcPr>
-            <w:tcW w:type="dxa" w:w="2880"/>
-          </w:tcPr>
-          <w:p>
-            <w:r>
-              <w:t>8</w:t>
-            </w:r>
-          </w:p>
-        </w:tc>
-        <w:tc>
-          <w:tcPr>
-            <w:tcW w:type="dxa" w:w="2880"/>
-          </w:tcPr>
-          <w:p>
-            <w:r>
-              <w:t>View storybook</w:t>
-            </w:r>
-          </w:p>
-        </w:tc>
-        <w:tc>
-          <w:tcPr>
-            <w:tcW w:type="dxa" w:w="2880"/>
-          </w:tcPr>
-          <w:p>
-            <w:r>
-              <w:t>5 illustrated pages with navigation</w:t>
-            </w:r>
-          </w:p>
-        </w:tc>
-      </w:tr>
-      <w:tr>
-        <w:tc>
-          <w:tcPr>
-            <w:tcW w:type="dxa" w:w="2880"/>
-          </w:tcPr>
-          <w:p>
-            <w:r>
-              <w:t>9</w:t>
-            </w:r>
-          </w:p>
-        </w:tc>
-        <w:tc>
-          <w:tcPr>
-            <w:tcW w:type="dxa" w:w="2880"/>
-          </w:tcPr>
-          <w:p>
-            <w:r>
-              <w:t>Click through to "Discussion &amp; Activities"</w:t>
-            </w:r>
-          </w:p>
-        </w:tc>
-        <w:tc>
-          <w:tcPr>
-            <w:tcW w:type="dxa" w:w="2880"/>
-          </w:tcPr>
-          <w:p>
-            <w:r>
-              <w:t>See discussion prompts + QA badge</w:t>
-            </w:r>
-          </w:p>
-        </w:tc>
-      </w:tr>
-    </w:tbl>
-    <w:p>
-      <w:pPr>
-        <w:pStyle w:val="Heading1"/>
-      </w:pPr>
-      <w:r>
-        <w:t>Technical Architecture</w:t>
-      </w:r>
-    </w:p>
-    <w:tbl>
-      <w:tblPr>
-        <w:tblStyle w:val="TableGrid"/>
-        <w:tblW w:type="auto" w:w="0"/>
-        <w:tblLook w:firstColumn="1" w:firstRow="1" w:lastColumn="0" w:lastRow="0" w:noHBand="0" w:noVBand="1" w:val="04A0"/>
-      </w:tblPr>
-      <w:tblGrid>
-        <w:gridCol w:w="2880"/>
-        <w:gridCol w:w="2880"/>
-        <w:gridCol w:w="2880"/>
-      </w:tblGrid>
-      <w:tr>
-        <w:tc>
-          <w:tcPr>
-            <w:tcW w:type="dxa" w:w="2880"/>
-            <w:shd w:fill="D9EAD3"/>
-          </w:tcPr>
-          <w:p>
-            <w:r>
-              <w:rPr>
-                <w:b/>
-              </w:rPr>
-              <w:t>Component</w:t>
-            </w:r>
-          </w:p>
-        </w:tc>
-        <w:tc>
-          <w:tcPr>
-            <w:tcW w:type="dxa" w:w="2880"/>
-            <w:shd w:fill="D9EAD3"/>
-          </w:tcPr>
-          <w:p>
-            <w:r>
-              <w:rPr>
-                <w:b/>
-              </w:rPr>
-              <w:t>Technology</w:t>
-            </w:r>
-          </w:p>
-        </w:tc>
-        <w:tc>
-          <w:tcPr>
-            <w:tcW w:type="dxa" w:w="2880"/>
-            <w:shd w:fill="D9EAD3"/>
-          </w:tcPr>
-          <w:p>
-            <w:r>
-              <w:rPr>
-                <w:b/>
-              </w:rPr>
               <w:t>Purpose</w:t>
             </w:r>
           </w:p>
@@ -1051,34 +353,265 @@
           </w:p>
         </w:tc>
       </w:tr>
+    </w:tbl>
+    <w:p/>
+    <w:p>
+      <w:pPr>
+        <w:pStyle w:val="Heading3"/>
+      </w:pPr>
+      <w:r>
+        <w:t>Dependencies</w:t>
+      </w:r>
+    </w:p>
+    <w:p/>
+    <w:p>
+      <w:pPr/>
+      <w:r>
+        <w:rPr>
+          <w:rFonts w:ascii="Courier New" w:hAnsi="Courier New"/>
+          <w:sz w:val="18"/>
+        </w:rPr>
+        <w:t># Backend (requirements.txt)</w:t>
+        <w:br/>
+        <w:t>flask&gt;=3.0.0</w:t>
+        <w:br/>
+        <w:t>openai&gt;=1.55.0</w:t>
+        <w:br/>
+        <w:t>python-dotenv&gt;=1.0.0</w:t>
+        <w:br/>
+        <w:t>gunicorn&gt;=21.0.0</w:t>
+        <w:br/>
+        <w:t>fastmcp&gt;=2.0.0</w:t>
+        <w:br/>
+        <w:br/>
+        <w:t># Frontend (package.json)</w:t>
+        <w:br/>
+        <w:t>react: ^18.2.0</w:t>
+        <w:br/>
+        <w:t>react-dom: ^18.2.0</w:t>
+        <w:br/>
+        <w:t>react-scripts: 5.0.1</w:t>
+      </w:r>
+    </w:p>
+    <w:p/>
+    <w:p>
+      <w:r>
+        <w:t>──────────────────────────────────────────────────</w:t>
+      </w:r>
+    </w:p>
+    <w:p/>
+    <w:p>
+      <w:pPr>
+        <w:pStyle w:val="Heading2"/>
+      </w:pPr>
+      <w:r>
+        <w:t>Architecture Diagram</w:t>
+      </w:r>
+    </w:p>
+    <w:p/>
+    <w:p>
+      <w:pPr/>
+      <w:r>
+        <w:rPr>
+          <w:rFonts w:ascii="Courier New" w:hAnsi="Courier New"/>
+          <w:sz w:val="18"/>
+        </w:rPr>
+        <w:t>┌─────────────────────────────────────────────────────────────┐</w:t>
+        <w:br/>
+        <w:t>│                        FRONTEND                              │</w:t>
+        <w:br/>
+        <w:t>│                     React 18 (Port 3000)                     │</w:t>
+        <w:br/>
+        <w:t>│  ┌─────────┐  ┌──────────┐  ┌────────────┐  ┌────────────┐  │</w:t>
+        <w:br/>
+        <w:t>│  │ Landing │→ │  Input   │→ │  Progress  │→ │ Storybook  │  │</w:t>
+        <w:br/>
+        <w:t>│  │  Page   │  │   Form   │  │   Screen   │  │   Viewer   │  │</w:t>
+        <w:br/>
+        <w:t>│  └─────────┘  └──────────┘  └────────────┘  └────────────┘  │</w:t>
+        <w:br/>
+        <w:t>└─────────────────────────┬───────────────────────────────────┘</w:t>
+        <w:br/>
+        <w:t xml:space="preserve">                          │ SSE Stream</w:t>
+        <w:br/>
+        <w:t xml:space="preserve">                          ▼</w:t>
+        <w:br/>
+        <w:t>┌─────────────────────────────────────────────────────────────┐</w:t>
+        <w:br/>
+        <w:t>│                        BACKEND                               │</w:t>
+        <w:br/>
+        <w:t>│                   Flask API (Port 5001)                      │</w:t>
+        <w:br/>
+        <w:t>│  ┌──────────────────────────────────────────────────────┐   │</w:t>
+        <w:br/>
+        <w:t>│  │                  /api/generate/stream                 │   │</w:t>
+        <w:br/>
+        <w:t>│  └──────────────────────────┬───────────────────────────┘   │</w:t>
+        <w:br/>
+        <w:t>│                             │                                │</w:t>
+        <w:br/>
+        <w:t>│  ┌──────────────────────────▼───────────────────────────┐   │</w:t>
+        <w:br/>
+        <w:t>│  │           GOOSE MCP SERVER (FastMCP)                  │   │</w:t>
+        <w:br/>
+        <w:t>│  │              mcp_server/server.py                     │   │</w:t>
+        <w:br/>
+        <w:t>│  │  ┌─────────────────────────────────────────────────┐  │   │</w:t>
+        <w:br/>
+        <w:t>│  │  │  5 MCP TOOLS (stdio transport, JSON-RPC 2.0)    │  │   │</w:t>
+        <w:br/>
+        <w:t>│  │  │                                                  │  │   │</w:t>
+        <w:br/>
+        <w:t>│  │  │  1. classify_stereotype  ──→ Claude Sonnet 4.5  │  │   │</w:t>
+        <w:br/>
+        <w:t>│  │  │  2. match_real_woman     ──→ Local KB (50 women)│  │   │</w:t>
+        <w:br/>
+        <w:t>│  │  │  3. generate_story       ──→ Claude Opus 4.6    │  │   │</w:t>
+        <w:br/>
+        <w:t>│  │  │  4. verify_story         ──→ Claude Sonnet 4.5  │  │   │</w:t>
+        <w:br/>
+        <w:t>│  │  │  5. generate_illustration──→ DALL-E 3           │  │   │</w:t>
+        <w:br/>
+        <w:t>│  │  └─────────────────────────────────────────────────┘  │   │</w:t>
+        <w:br/>
+        <w:t>│  └───────────────────────────────────────────────────────┘   │</w:t>
+        <w:br/>
+        <w:t>└─────────────────────────┬───────────────────────────────────┘</w:t>
+        <w:br/>
+        <w:t xml:space="preserve">                          │</w:t>
+        <w:br/>
+        <w:t xml:space="preserve">        ┌─────────────────┼─────────────────┐</w:t>
+        <w:br/>
+        <w:t xml:space="preserve">        ▼                 ▼                 ▼</w:t>
+        <w:br/>
+        <w:t>┌──────────────┐  ┌──────────────┐  ┌──────────────┐</w:t>
+        <w:br/>
+        <w:t>│   Claude     │  │   Claude     │  │   DALL-E 3   │</w:t>
+        <w:br/>
+        <w:t>│  Opus 4.6    │  │  Sonnet 4.5  │  │   (OpenAI)   │</w:t>
+        <w:br/>
+        <w:t>│  (Stories)   │  │  (QA/Class)  │  │ (Illustrations)│</w:t>
+        <w:br/>
+        <w:t>│  OpenRouter  │  │  OpenRouter  │  │              │</w:t>
+        <w:br/>
+        <w:t>└──────────────┘  └──────────────┘  └──────────────┘</w:t>
+      </w:r>
+    </w:p>
+    <w:p/>
+    <w:p>
+      <w:r>
+        <w:t>──────────────────────────────────────────────────</w:t>
+      </w:r>
+    </w:p>
+    <w:p/>
+    <w:p>
+      <w:pPr>
+        <w:pStyle w:val="Heading2"/>
+      </w:pPr>
+      <w:r>
+        <w:t>Goose + MCP Integration</w:t>
+      </w:r>
+    </w:p>
+    <w:p/>
+    <w:p>
+      <w:r>
+        <w:t>EqualTales is a Goose-compatible MCP (Model Context Protocol) extension. The entire story generation engine is exposed as 5 MCP tools that Goose can orchestrate autonomously.</w:t>
+      </w:r>
+    </w:p>
+    <w:p/>
+    <w:p>
+      <w:pPr>
+        <w:pStyle w:val="Heading3"/>
+      </w:pPr>
+      <w:r>
+        <w:t>MCP Server Configuration</w:t>
+      </w:r>
+    </w:p>
+    <w:p/>
+    <w:p>
+      <w:pPr/>
+      <w:r>
+        <w:rPr>
+          <w:rFonts w:ascii="Courier New" w:hAnsi="Courier New"/>
+          <w:sz w:val="18"/>
+        </w:rPr>
+        <w:t># goose_config.yaml — Goose extension config</w:t>
+        <w:br/>
+        <w:t>extensions:</w:t>
+        <w:br/>
+        <w:t xml:space="preserve">  equaltales:</w:t>
+        <w:br/>
+        <w:t xml:space="preserve">    name: EqualTales Story Engine</w:t>
+        <w:br/>
+        <w:t xml:space="preserve">    cmd: python</w:t>
+        <w:br/>
+        <w:t xml:space="preserve">    args: [mcp_server/server.py]</w:t>
+        <w:br/>
+        <w:t xml:space="preserve">    transport: stdio</w:t>
+        <w:br/>
+        <w:t xml:space="preserve">    enabled: true</w:t>
+      </w:r>
+    </w:p>
+    <w:p/>
+    <w:p>
+      <w:pPr>
+        <w:pStyle w:val="Heading3"/>
+      </w:pPr>
+      <w:r>
+        <w:t>The 5 MCP Tools</w:t>
+      </w:r>
+    </w:p>
+    <w:p/>
+    <w:tbl>
+      <w:tblPr>
+        <w:tblStyle w:val="TableGrid"/>
+        <w:tblW w:type="auto" w:w="0"/>
+        <w:tblLook w:firstColumn="1" w:firstRow="1" w:lastColumn="0" w:lastRow="0" w:noHBand="0" w:noVBand="1" w:val="04A0"/>
+      </w:tblPr>
+      <w:tblGrid>
+        <w:gridCol w:w="2160"/>
+        <w:gridCol w:w="2160"/>
+        <w:gridCol w:w="2160"/>
+        <w:gridCol w:w="2160"/>
+      </w:tblGrid>
       <w:tr>
         <w:tc>
           <w:tcPr>
-            <w:tcW w:type="dxa" w:w="2880"/>
+            <w:tcW w:type="dxa" w:w="2160"/>
           </w:tcPr>
           <w:p>
             <w:r>
-              <w:t>Hosting</w:t>
+              <w:t>Tool</w:t>
             </w:r>
           </w:p>
         </w:tc>
         <w:tc>
           <w:tcPr>
-            <w:tcW w:type="dxa" w:w="2880"/>
+            <w:tcW w:type="dxa" w:w="2160"/>
           </w:tcPr>
           <w:p>
             <w:r>
-              <w:t>Vercel + Render</w:t>
+              <w:t>Model</w:t>
             </w:r>
           </w:p>
         </w:tc>
         <w:tc>
           <w:tcPr>
-            <w:tcW w:type="dxa" w:w="2880"/>
+            <w:tcW w:type="dxa" w:w="2160"/>
           </w:tcPr>
           <w:p>
             <w:r>
-              <w:t>Frontend + backend deployment</w:t>
+              <w:t>Purpose</w:t>
+            </w:r>
+          </w:p>
+        </w:tc>
+        <w:tc>
+          <w:tcPr>
+            <w:tcW w:type="dxa" w:w="2160"/>
+          </w:tcPr>
+          <w:p>
+            <w:r>
+              <w:t>Latency</w:t>
             </w:r>
           </w:p>
         </w:tc>
@@ -1086,87 +619,445 @@
       <w:tr>
         <w:tc>
           <w:tcPr>
-            <w:tcW w:type="dxa" w:w="2880"/>
+            <w:tcW w:type="dxa" w:w="2160"/>
           </w:tcPr>
           <w:p>
             <w:r>
-              <w:t>Streaming</w:t>
+              <w:t>`classify_stereotype`</w:t>
             </w:r>
           </w:p>
         </w:tc>
         <w:tc>
           <w:tcPr>
-            <w:tcW w:type="dxa" w:w="2880"/>
+            <w:tcW w:type="dxa" w:w="2160"/>
           </w:tcPr>
           <w:p>
             <w:r>
-              <w:t>Server-Sent Events</w:t>
+              <w:t>Claude Sonnet 4.5</w:t>
             </w:r>
           </w:p>
         </w:tc>
         <w:tc>
           <w:tcPr>
-            <w:tcW w:type="dxa" w:w="2880"/>
+            <w:tcW w:type="dxa" w:w="2160"/>
           </w:tcPr>
           <w:p>
             <w:r>
-              <w:t>Real-time progress updates</w:t>
+              <w:t>Categorize stereotype into 14 categories</w:t>
+            </w:r>
+          </w:p>
+        </w:tc>
+        <w:tc>
+          <w:tcPr>
+            <w:tcW w:type="dxa" w:w="2160"/>
+          </w:tcPr>
+          <w:p>
+            <w:r>
+              <w:t>~3s</w:t>
+            </w:r>
+          </w:p>
+        </w:tc>
+      </w:tr>
+      <w:tr>
+        <w:tc>
+          <w:tcPr>
+            <w:tcW w:type="dxa" w:w="2160"/>
+          </w:tcPr>
+          <w:p>
+            <w:r>
+              <w:t>`match_real_woman`</w:t>
+            </w:r>
+          </w:p>
+        </w:tc>
+        <w:tc>
+          <w:tcPr>
+            <w:tcW w:type="dxa" w:w="2160"/>
+          </w:tcPr>
+          <w:p>
+            <w:r>
+              <w:t>Local KB</w:t>
+            </w:r>
+          </w:p>
+        </w:tc>
+        <w:tc>
+          <w:tcPr>
+            <w:tcW w:type="dxa" w:w="2160"/>
+          </w:tcPr>
+          <w:p>
+            <w:r>
+              <w:t>Find best-matching woman from 50-entry knowledge base</w:t>
+            </w:r>
+          </w:p>
+        </w:tc>
+        <w:tc>
+          <w:tcPr>
+            <w:tcW w:type="dxa" w:w="2160"/>
+          </w:tcPr>
+          <w:p>
+            <w:r>
+              <w:t>&lt;0.1s</w:t>
+            </w:r>
+          </w:p>
+        </w:tc>
+      </w:tr>
+      <w:tr>
+        <w:tc>
+          <w:tcPr>
+            <w:tcW w:type="dxa" w:w="2160"/>
+          </w:tcPr>
+          <w:p>
+            <w:r>
+              <w:t>`generate_story`</w:t>
+            </w:r>
+          </w:p>
+        </w:tc>
+        <w:tc>
+          <w:tcPr>
+            <w:tcW w:type="dxa" w:w="2160"/>
+          </w:tcPr>
+          <w:p>
+            <w:r>
+              <w:t>Claude Opus 4.6</w:t>
+            </w:r>
+          </w:p>
+        </w:tc>
+        <w:tc>
+          <w:tcPr>
+            <w:tcW w:type="dxa" w:w="2160"/>
+          </w:tcPr>
+          <w:p>
+            <w:r>
+              <w:t>Create 5-page narrative with illustrations descriptions</w:t>
+            </w:r>
+          </w:p>
+        </w:tc>
+        <w:tc>
+          <w:tcPr>
+            <w:tcW w:type="dxa" w:w="2160"/>
+          </w:tcPr>
+          <w:p>
+            <w:r>
+              <w:t>~57s</w:t>
+            </w:r>
+          </w:p>
+        </w:tc>
+      </w:tr>
+      <w:tr>
+        <w:tc>
+          <w:tcPr>
+            <w:tcW w:type="dxa" w:w="2160"/>
+          </w:tcPr>
+          <w:p>
+            <w:r>
+              <w:t>`verify_story`</w:t>
+            </w:r>
+          </w:p>
+        </w:tc>
+        <w:tc>
+          <w:tcPr>
+            <w:tcW w:type="dxa" w:w="2160"/>
+          </w:tcPr>
+          <w:p>
+            <w:r>
+              <w:t>Claude Sonnet 4.5</w:t>
+            </w:r>
+          </w:p>
+        </w:tc>
+        <w:tc>
+          <w:tcPr>
+            <w:tcW w:type="dxa" w:w="2160"/>
+          </w:tcPr>
+          <w:p>
+            <w:r>
+              <w:t>QA check for stereotype reinforcement</w:t>
+            </w:r>
+          </w:p>
+        </w:tc>
+        <w:tc>
+          <w:tcPr>
+            <w:tcW w:type="dxa" w:w="2160"/>
+          </w:tcPr>
+          <w:p>
+            <w:r>
+              <w:t>~5s</w:t>
+            </w:r>
+          </w:p>
+        </w:tc>
+      </w:tr>
+      <w:tr>
+        <w:tc>
+          <w:tcPr>
+            <w:tcW w:type="dxa" w:w="2160"/>
+          </w:tcPr>
+          <w:p>
+            <w:r>
+              <w:t>`generate_illustration`</w:t>
+            </w:r>
+          </w:p>
+        </w:tc>
+        <w:tc>
+          <w:tcPr>
+            <w:tcW w:type="dxa" w:w="2160"/>
+          </w:tcPr>
+          <w:p>
+            <w:r>
+              <w:t>DALL-E 3</w:t>
+            </w:r>
+          </w:p>
+        </w:tc>
+        <w:tc>
+          <w:tcPr>
+            <w:tcW w:type="dxa" w:w="2160"/>
+          </w:tcPr>
+          <w:p>
+            <w:r>
+              <w:t>Create watercolor children's book illustration</w:t>
+            </w:r>
+          </w:p>
+        </w:tc>
+        <w:tc>
+          <w:tcPr>
+            <w:tcW w:type="dxa" w:w="2160"/>
+          </w:tcPr>
+          <w:p>
+            <w:r>
+              <w:t>~15s</w:t>
             </w:r>
           </w:p>
         </w:tc>
       </w:tr>
     </w:tbl>
+    <w:p/>
+    <w:p>
+      <w:pPr>
+        <w:pStyle w:val="Heading3"/>
+      </w:pPr>
+      <w:r>
+        <w:t>How Goose Orchestrates</w:t>
+      </w:r>
+    </w:p>
+    <w:p/>
+    <w:p>
+      <w:r>
+        <w:t>When Goose receives a stereotype input, it autonomously:</w:t>
+      </w:r>
+    </w:p>
+    <w:p/>
+    <w:p>
+      <w:pPr>
+        <w:pStyle w:val="ListNumber"/>
+      </w:pPr>
+      <w:r>
+        <w:t>**Classifies** the stereotype → identifies primary/secondary categories</w:t>
+      </w:r>
+    </w:p>
+    <w:p>
+      <w:pPr>
+        <w:pStyle w:val="ListNumber"/>
+      </w:pPr>
+      <w:r>
+        <w:t>**Matches** a real woman → finds inspiring counter-example from KB</w:t>
+      </w:r>
+    </w:p>
+    <w:p>
+      <w:pPr>
+        <w:pStyle w:val="ListNumber"/>
+      </w:pPr>
+      <w:r>
+        <w:t>**Generates** the story → creates age-appropriate 5-page narrative</w:t>
+      </w:r>
+    </w:p>
+    <w:p>
+      <w:pPr>
+        <w:pStyle w:val="ListNumber"/>
+      </w:pPr>
+      <w:r>
+        <w:t>**Verifies** (parallel) → ensures no stereotype reinforcement</w:t>
+      </w:r>
+    </w:p>
+    <w:p>
+      <w:pPr>
+        <w:pStyle w:val="ListNumber"/>
+      </w:pPr>
+      <w:r>
+        <w:t>**Illustrates** (parallel) → generates 5 DALL-E images concurrently</w:t>
+      </w:r>
+    </w:p>
+    <w:p/>
+    <w:p>
+      <w:r>
+        <w:t>The Flask backend can run in two modes:</w:t>
+      </w:r>
+    </w:p>
+    <w:p>
+      <w:pPr>
+        <w:pStyle w:val="ListBullet"/>
+      </w:pPr>
+      <w:r>
+        <w:t>**Direct mode**: Imports MCP tools directly (current production)</w:t>
+      </w:r>
+    </w:p>
+    <w:p>
+      <w:pPr>
+        <w:pStyle w:val="ListBullet"/>
+      </w:pPr>
+      <w:r>
+        <w:t>**Goose mode**: Goose orchestrates via stdio transport (full MCP pattern)</w:t>
+      </w:r>
+    </w:p>
+    <w:p/>
+    <w:p>
+      <w:pPr>
+        <w:pStyle w:val="Heading3"/>
+      </w:pPr>
+      <w:r>
+        <w:t>Why MCP + Goose?</w:t>
+      </w:r>
+    </w:p>
+    <w:p/>
+    <w:tbl>
+      <w:tblPr>
+        <w:tblStyle w:val="TableGrid"/>
+        <w:tblW w:type="auto" w:w="0"/>
+        <w:tblLook w:firstColumn="1" w:firstRow="1" w:lastColumn="0" w:lastRow="0" w:noHBand="0" w:noVBand="1" w:val="04A0"/>
+      </w:tblPr>
+      <w:tblGrid>
+        <w:gridCol w:w="4320"/>
+        <w:gridCol w:w="4320"/>
+      </w:tblGrid>
+      <w:tr>
+        <w:tc>
+          <w:tcPr>
+            <w:tcW w:type="dxa" w:w="4320"/>
+          </w:tcPr>
+          <w:p>
+            <w:r>
+              <w:t>Benefit</w:t>
+            </w:r>
+          </w:p>
+        </w:tc>
+        <w:tc>
+          <w:tcPr>
+            <w:tcW w:type="dxa" w:w="4320"/>
+          </w:tcPr>
+          <w:p>
+            <w:r>
+              <w:t>How</w:t>
+            </w:r>
+          </w:p>
+        </w:tc>
+      </w:tr>
+      <w:tr>
+        <w:tc>
+          <w:tcPr>
+            <w:tcW w:type="dxa" w:w="4320"/>
+          </w:tcPr>
+          <w:p>
+            <w:r>
+              <w:t>**Autonomous orchestration**</w:t>
+            </w:r>
+          </w:p>
+        </w:tc>
+        <w:tc>
+          <w:tcPr>
+            <w:tcW w:type="dxa" w:w="4320"/>
+          </w:tcPr>
+          <w:p>
+            <w:r>
+              <w:t>Goose decides tool order and handles errors</w:t>
+            </w:r>
+          </w:p>
+        </w:tc>
+      </w:tr>
+      <w:tr>
+        <w:tc>
+          <w:tcPr>
+            <w:tcW w:type="dxa" w:w="4320"/>
+          </w:tcPr>
+          <w:p>
+            <w:r>
+              <w:t>**Tool composability**</w:t>
+            </w:r>
+          </w:p>
+        </w:tc>
+        <w:tc>
+          <w:tcPr>
+            <w:tcW w:type="dxa" w:w="4320"/>
+          </w:tcPr>
+          <w:p>
+            <w:r>
+              <w:t>Each tool is independent and reusable</w:t>
+            </w:r>
+          </w:p>
+        </w:tc>
+      </w:tr>
+      <w:tr>
+        <w:tc>
+          <w:tcPr>
+            <w:tcW w:type="dxa" w:w="4320"/>
+          </w:tcPr>
+          <w:p>
+            <w:r>
+              <w:t>**Streaming support**</w:t>
+            </w:r>
+          </w:p>
+        </w:tc>
+        <w:tc>
+          <w:tcPr>
+            <w:tcW w:type="dxa" w:w="4320"/>
+          </w:tcPr>
+          <w:p>
+            <w:r>
+              <w:t>Real-time progress via SSE</w:t>
+            </w:r>
+          </w:p>
+        </w:tc>
+      </w:tr>
+      <w:tr>
+        <w:tc>
+          <w:tcPr>
+            <w:tcW w:type="dxa" w:w="4320"/>
+          </w:tcPr>
+          <w:p>
+            <w:r>
+              <w:t>**Error recovery**</w:t>
+            </w:r>
+          </w:p>
+        </w:tc>
+        <w:tc>
+          <w:tcPr>
+            <w:tcW w:type="dxa" w:w="4320"/>
+          </w:tcPr>
+          <w:p>
+            <w:r>
+              <w:t>Goose retries failed tools automatically</w:t>
+            </w:r>
+          </w:p>
+        </w:tc>
+      </w:tr>
+    </w:tbl>
+    <w:p/>
+    <w:p>
+      <w:r>
+        <w:t>──────────────────────────────────────────────────</w:t>
+      </w:r>
+    </w:p>
+    <w:p/>
     <w:p>
       <w:pPr>
         <w:pStyle w:val="Heading2"/>
       </w:pPr>
       <w:r>
-        <w:t>Goose Integration</w:t>
+        <w:t>Decision Log</w:t>
       </w:r>
     </w:p>
+    <w:p/>
     <w:p>
       <w:r>
-        <w:t>EqualTales uses Goose (Block's open-source AI agent framework) with FastMCP to expose 5 tools:</w:t>
+        <w:t>Key technical choices and tradeoffs:</w:t>
       </w:r>
     </w:p>
-    <w:p>
-      <w:r>
-        <w:t>1. classify_stereotype — Categorizes input and selects counter-narrative strategy</w:t>
-      </w:r>
-    </w:p>
-    <w:p>
-      <w:r>
-        <w:t>2. match_real_woman — Finds best woman from 50-entry knowledge base</w:t>
-      </w:r>
-    </w:p>
-    <w:p>
-      <w:r>
-        <w:t>3. generate_story — Creates 5-page narrative with discussion prompts</w:t>
-      </w:r>
-    </w:p>
-    <w:p>
-      <w:r>
-        <w:t>4. verify_story — QA check for stereotype reinforcement (score 1-10)</w:t>
-      </w:r>
-    </w:p>
-    <w:p>
-      <w:r>
-        <w:t>5. generate_illustration — DALL-E 3 call with character consistency</w:t>
-      </w:r>
-    </w:p>
-    <w:p>
-      <w:pPr>
-        <w:pStyle w:val="Heading1"/>
-      </w:pPr>
-      <w:r>
-        <w:t>Story Structure</w:t>
-      </w:r>
-    </w:p>
-    <w:p>
-      <w:r>
-        <w:t>Each story follows a 5-page narrative arc:</w:t>
-      </w:r>
-    </w:p>
+    <w:p/>
     <w:tbl>
       <w:tblPr>
         <w:tblStyle w:val="TableGrid"/>
@@ -1182,42 +1073,30 @@
         <w:tc>
           <w:tcPr>
             <w:tcW w:type="dxa" w:w="2880"/>
-            <w:shd w:fill="D9EAD3"/>
           </w:tcPr>
           <w:p>
             <w:r>
-              <w:rPr>
-                <w:b/>
-              </w:rPr>
-              <w:t>Page</w:t>
+              <w:t>Decision</w:t>
             </w:r>
           </w:p>
         </w:tc>
         <w:tc>
           <w:tcPr>
             <w:tcW w:type="dxa" w:w="2880"/>
-            <w:shd w:fill="D9EAD3"/>
           </w:tcPr>
           <w:p>
             <w:r>
-              <w:rPr>
-                <w:b/>
-              </w:rPr>
-              <w:t>Title</w:t>
+              <w:t>Why</w:t>
             </w:r>
           </w:p>
         </w:tc>
         <w:tc>
           <w:tcPr>
             <w:tcW w:type="dxa" w:w="2880"/>
-            <w:shd w:fill="D9EAD3"/>
           </w:tcPr>
           <w:p>
             <w:r>
-              <w:rPr>
-                <w:b/>
-              </w:rPr>
-              <w:t>Purpose</w:t>
+              <w:t>Tradeoff</w:t>
             </w:r>
           </w:p>
         </w:tc>
@@ -1229,7 +1108,7 @@
           </w:tcPr>
           <w:p>
             <w:r>
-              <w:t>1</w:t>
+              <w:t>**React 18 + CRA**</w:t>
             </w:r>
           </w:p>
         </w:tc>
@@ -1239,7 +1118,7 @@
           </w:tcPr>
           <w:p>
             <w:r>
-              <w:t>The Belief</w:t>
+              <w:t>Fastest setup for 8-day hackathon; built-in Jest</w:t>
             </w:r>
           </w:p>
         </w:tc>
@@ -1249,7 +1128,7 @@
           </w:tcPr>
           <w:p>
             <w:r>
-              <w:t>Fictional child encounters/expresses the stereotype</w:t>
+              <w:t>Slower builds than Vite; acceptable for demo</w:t>
             </w:r>
           </w:p>
         </w:tc>
@@ -1261,7 +1140,7 @@
           </w:tcPr>
           <w:p>
             <w:r>
-              <w:t>2</w:t>
+              <w:t>**Flask over FastAPI**</w:t>
             </w:r>
           </w:p>
         </w:tc>
@@ -1271,7 +1150,7 @@
           </w:tcPr>
           <w:p>
             <w:r>
-              <w:t>The Question</w:t>
+              <w:t>Simpler synchronous code; easier debugging</w:t>
             </w:r>
           </w:p>
         </w:tc>
@@ -1281,7 +1160,7 @@
           </w:tcPr>
           <w:p>
             <w:r>
-              <w:t>Something cracks the stereotype — curiosity emerges</w:t>
+              <w:t>No native async; SSE works fine with stream_with_context</w:t>
             </w:r>
           </w:p>
         </w:tc>
@@ -1293,7 +1172,7 @@
           </w:tcPr>
           <w:p>
             <w:r>
-              <w:t>3</w:t>
+              <w:t>**SSE over WebSockets**</w:t>
             </w:r>
           </w:p>
         </w:tc>
@@ -1303,7 +1182,7 @@
           </w:tcPr>
           <w:p>
             <w:r>
-              <w:t>The Discovery</w:t>
+              <w:t>One-way streaming is simpler; works through corporate firewalls</w:t>
             </w:r>
           </w:p>
         </w:tc>
@@ -1313,7 +1192,7 @@
           </w:tcPr>
           <w:p>
             <w:r>
-              <w:t>Child discovers a real woman who defied it</w:t>
+              <w:t>Slightly more complex than polling</w:t>
             </w:r>
           </w:p>
         </w:tc>
@@ -1325,7 +1204,7 @@
           </w:tcPr>
           <w:p>
             <w:r>
-              <w:t>4</w:t>
+              <w:t>**Parallel illustrations**</w:t>
             </w:r>
           </w:p>
         </w:tc>
@@ -1335,7 +1214,7 @@
           </w:tcPr>
           <w:p>
             <w:r>
-              <w:t>The Inspiration</w:t>
+              <w:t>ThreadPoolExecutor runs 5 DALL-E calls simultaneously</w:t>
             </w:r>
           </w:p>
         </w:tc>
@@ -1345,7 +1224,7 @@
           </w:tcPr>
           <w:p>
             <w:r>
-              <w:t>Real woman's achievement told in fairy-tale language</w:t>
+              <w:t>Higher momentary API load; saves ~60 seconds</w:t>
             </w:r>
           </w:p>
         </w:tc>
@@ -1357,7 +1236,7 @@
           </w:tcPr>
           <w:p>
             <w:r>
-              <w:t>5</w:t>
+              <w:t>**Claude Opus for stories**</w:t>
             </w:r>
           </w:p>
         </w:tc>
@@ -1367,7 +1246,7 @@
           </w:tcPr>
           <w:p>
             <w:r>
-              <w:t>The New Belief</w:t>
+              <w:t>Highest quality creative writing ($15/M tokens)</w:t>
             </w:r>
           </w:p>
         </w:tc>
@@ -1377,20 +1256,2110 @@
           </w:tcPr>
           <w:p>
             <w:r>
-              <w:t>Child takes action, stereotype replaced by understanding</w:t>
+              <w:t>Expensive; but story quality is core differentiator</w:t>
+            </w:r>
+          </w:p>
+        </w:tc>
+      </w:tr>
+      <w:tr>
+        <w:tc>
+          <w:tcPr>
+            <w:tcW w:type="dxa" w:w="2880"/>
+          </w:tcPr>
+          <w:p>
+            <w:r>
+              <w:t>**Claude Sonnet for QA**</w:t>
+            </w:r>
+          </w:p>
+        </w:tc>
+        <w:tc>
+          <w:tcPr>
+            <w:tcW w:type="dxa" w:w="2880"/>
+          </w:tcPr>
+          <w:p>
+            <w:r>
+              <w:t>5x cheaper ($3/M tokens) for analytical tasks</w:t>
+            </w:r>
+          </w:p>
+        </w:tc>
+        <w:tc>
+          <w:tcPr>
+            <w:tcW w:type="dxa" w:w="2880"/>
+          </w:tcPr>
+          <w:p>
+            <w:r>
+              <w:t>Lower creativity; fine for classification/verification</w:t>
+            </w:r>
+          </w:p>
+        </w:tc>
+      </w:tr>
+      <w:tr>
+        <w:tc>
+          <w:tcPr>
+            <w:tcW w:type="dxa" w:w="2880"/>
+          </w:tcPr>
+          <w:p>
+            <w:r>
+              <w:t>**No database**</w:t>
+            </w:r>
+          </w:p>
+        </w:tc>
+        <w:tc>
+          <w:tcPr>
+            <w:tcW w:type="dxa" w:w="2880"/>
+          </w:tcPr>
+          <w:p>
+            <w:r>
+              <w:t>Privacy by design — can't leak what we don't store</w:t>
+            </w:r>
+          </w:p>
+        </w:tc>
+        <w:tc>
+          <w:tcPr>
+            <w:tcW w:type="dxa" w:w="2880"/>
+          </w:tcPr>
+          <w:p>
+            <w:r>
+              <w:t>No persistence; acceptable for demo</w:t>
+            </w:r>
+          </w:p>
+        </w:tc>
+      </w:tr>
+      <w:tr>
+        <w:tc>
+          <w:tcPr>
+            <w:tcW w:type="dxa" w:w="2880"/>
+          </w:tcPr>
+          <w:p>
+            <w:r>
+              <w:t>**50-woman curated KB**</w:t>
+            </w:r>
+          </w:p>
+        </w:tc>
+        <w:tc>
+          <w:tcPr>
+            <w:tcW w:type="dxa" w:w="2880"/>
+          </w:tcPr>
+          <w:p>
+            <w:r>
+              <w:t>Quality over quantity; manually verified facts</w:t>
+            </w:r>
+          </w:p>
+        </w:tc>
+        <w:tc>
+          <w:tcPr>
+            <w:tcW w:type="dxa" w:w="2880"/>
+          </w:tcPr>
+          <w:p>
+            <w:r>
+              <w:t>Limited coverage; ensures accuracy</w:t>
+            </w:r>
+          </w:p>
+        </w:tc>
+      </w:tr>
+      <w:tr>
+        <w:tc>
+          <w:tcPr>
+            <w:tcW w:type="dxa" w:w="2880"/>
+          </w:tcPr>
+          <w:p>
+            <w:r>
+              <w:t>**QA verification loop**</w:t>
+            </w:r>
+          </w:p>
+        </w:tc>
+        <w:tc>
+          <w:tcPr>
+            <w:tcW w:type="dxa" w:w="2880"/>
+          </w:tcPr>
+          <w:p>
+            <w:r>
+              <w:t>Catches stereotype reinforcement AI typically amplifies</w:t>
+            </w:r>
+          </w:p>
+        </w:tc>
+        <w:tc>
+          <w:tcPr>
+            <w:tcW w:type="dxa" w:w="2880"/>
+          </w:tcPr>
+          <w:p>
+            <w:r>
+              <w:t>Adds ~3s; essential for ethical credibility</w:t>
             </w:r>
           </w:p>
         </w:tc>
       </w:tr>
     </w:tbl>
+    <w:p/>
+    <w:p>
+      <w:r>
+        <w:t>[Full Decision Log →](docs/DECISION_LOG.md)</w:t>
+      </w:r>
+    </w:p>
+    <w:p/>
+    <w:p>
+      <w:r>
+        <w:t>──────────────────────────────────────────────────</w:t>
+      </w:r>
+    </w:p>
+    <w:p/>
     <w:p>
       <w:pPr>
-        <w:pStyle w:val="Heading1"/>
+        <w:pStyle w:val="Heading2"/>
       </w:pPr>
       <w:r>
-        <w:t>Project Logs &amp; Documentation</w:t>
+        <w:t>AI Trace Log</w:t>
       </w:r>
     </w:p>
+    <w:p/>
+    <w:p>
+      <w:r>
+        <w:t>Required for AI/ML track — documenting AI tool usage with verification</w:t>
+      </w:r>
+    </w:p>
+    <w:p/>
+    <w:p>
+      <w:pPr>
+        <w:pStyle w:val="Heading3"/>
+      </w:pPr>
+      <w:r>
+        <w:t>Trace 1: Story Generation</w:t>
+      </w:r>
+    </w:p>
+    <w:tbl>
+      <w:tblPr>
+        <w:tblStyle w:val="TableGrid"/>
+        <w:tblW w:type="auto" w:w="0"/>
+        <w:tblLook w:firstColumn="1" w:firstRow="1" w:lastColumn="0" w:lastRow="0" w:noHBand="0" w:noVBand="1" w:val="04A0"/>
+      </w:tblPr>
+      <w:tblGrid>
+        <w:gridCol w:w="4320"/>
+        <w:gridCol w:w="4320"/>
+      </w:tblGrid>
+      <w:tr>
+        <w:tc>
+          <w:tcPr>
+            <w:tcW w:type="dxa" w:w="4320"/>
+          </w:tcPr>
+          <w:p>
+            <w:r>
+              <w:t>Field</w:t>
+            </w:r>
+          </w:p>
+        </w:tc>
+        <w:tc>
+          <w:tcPr>
+            <w:tcW w:type="dxa" w:w="4320"/>
+          </w:tcPr>
+          <w:p>
+            <w:r>
+              <w:t>Content</w:t>
+            </w:r>
+          </w:p>
+        </w:tc>
+      </w:tr>
+      <w:tr>
+        <w:tc>
+          <w:tcPr>
+            <w:tcW w:type="dxa" w:w="4320"/>
+          </w:tcPr>
+          <w:p>
+            <w:r>
+              <w:t>**Tool**</w:t>
+            </w:r>
+          </w:p>
+        </w:tc>
+        <w:tc>
+          <w:tcPr>
+            <w:tcW w:type="dxa" w:w="4320"/>
+          </w:tcPr>
+          <w:p>
+            <w:r>
+              <w:t>Claude Opus 4.6 via OpenRouter</w:t>
+            </w:r>
+          </w:p>
+        </w:tc>
+      </w:tr>
+      <w:tr>
+        <w:tc>
+          <w:tcPr>
+            <w:tcW w:type="dxa" w:w="4320"/>
+          </w:tcPr>
+          <w:p>
+            <w:r>
+              <w:t>**What AI Generated**</w:t>
+            </w:r>
+          </w:p>
+        </w:tc>
+        <w:tc>
+          <w:tcPr>
+            <w:tcW w:type="dxa" w:w="4320"/>
+          </w:tcPr>
+          <w:p>
+            <w:r>
+              <w:t>5-page narrative with titles, discussion prompts, activity suggestion</w:t>
+            </w:r>
+          </w:p>
+        </w:tc>
+      </w:tr>
+      <w:tr>
+        <w:tc>
+          <w:tcPr>
+            <w:tcW w:type="dxa" w:w="4320"/>
+          </w:tcPr>
+          <w:p>
+            <w:r>
+              <w:t>**What I Changed**</w:t>
+            </w:r>
+          </w:p>
+        </w:tc>
+        <w:tc>
+          <w:tcPr>
+            <w:tcW w:type="dxa" w:w="4320"/>
+          </w:tcPr>
+          <w:p>
+            <w:r>
+              <w:t>Added instruction NOT to describe child's race (handled by diversity system); enforced JSON output</w:t>
+            </w:r>
+          </w:p>
+        </w:tc>
+      </w:tr>
+      <w:tr>
+        <w:tc>
+          <w:tcPr>
+            <w:tcW w:type="dxa" w:w="4320"/>
+          </w:tcPr>
+          <w:p>
+            <w:r>
+              <w:t>**Verification**</w:t>
+            </w:r>
+          </w:p>
+        </w:tc>
+        <w:tc>
+          <w:tcPr>
+            <w:tcW w:type="dxa" w:w="4320"/>
+          </w:tcPr>
+          <w:p>
+            <w:r>
+              <w:t>Manual review of 10+ stories; automated QA loop; checked discussion prompts are open-ended</w:t>
+            </w:r>
+          </w:p>
+        </w:tc>
+      </w:tr>
+    </w:tbl>
+    <w:p/>
+    <w:p>
+      <w:pPr>
+        <w:pStyle w:val="Heading3"/>
+      </w:pPr>
+      <w:r>
+        <w:t>Trace 2: QA Verification</w:t>
+      </w:r>
+    </w:p>
+    <w:tbl>
+      <w:tblPr>
+        <w:tblStyle w:val="TableGrid"/>
+        <w:tblW w:type="auto" w:w="0"/>
+        <w:tblLook w:firstColumn="1" w:firstRow="1" w:lastColumn="0" w:lastRow="0" w:noHBand="0" w:noVBand="1" w:val="04A0"/>
+      </w:tblPr>
+      <w:tblGrid>
+        <w:gridCol w:w="4320"/>
+        <w:gridCol w:w="4320"/>
+      </w:tblGrid>
+      <w:tr>
+        <w:tc>
+          <w:tcPr>
+            <w:tcW w:type="dxa" w:w="4320"/>
+          </w:tcPr>
+          <w:p>
+            <w:r>
+              <w:t>Field</w:t>
+            </w:r>
+          </w:p>
+        </w:tc>
+        <w:tc>
+          <w:tcPr>
+            <w:tcW w:type="dxa" w:w="4320"/>
+          </w:tcPr>
+          <w:p>
+            <w:r>
+              <w:t>Content</w:t>
+            </w:r>
+          </w:p>
+        </w:tc>
+      </w:tr>
+      <w:tr>
+        <w:tc>
+          <w:tcPr>
+            <w:tcW w:type="dxa" w:w="4320"/>
+          </w:tcPr>
+          <w:p>
+            <w:r>
+              <w:t>**Tool**</w:t>
+            </w:r>
+          </w:p>
+        </w:tc>
+        <w:tc>
+          <w:tcPr>
+            <w:tcW w:type="dxa" w:w="4320"/>
+          </w:tcPr>
+          <w:p>
+            <w:r>
+              <w:t>Claude Sonnet 4.5 via OpenRouter</w:t>
+            </w:r>
+          </w:p>
+        </w:tc>
+      </w:tr>
+      <w:tr>
+        <w:tc>
+          <w:tcPr>
+            <w:tcW w:type="dxa" w:w="4320"/>
+          </w:tcPr>
+          <w:p>
+            <w:r>
+              <w:t>**What AI Generated**</w:t>
+            </w:r>
+          </w:p>
+        </w:tc>
+        <w:tc>
+          <w:tcPr>
+            <w:tcW w:type="dxa" w:w="4320"/>
+          </w:tcPr>
+          <w:p>
+            <w:r>
+              <w:t>Passed/failed status, score 1-10, issues list, strengths</w:t>
+            </w:r>
+          </w:p>
+        </w:tc>
+      </w:tr>
+      <w:tr>
+        <w:tc>
+          <w:tcPr>
+            <w:tcW w:type="dxa" w:w="4320"/>
+          </w:tcPr>
+          <w:p>
+            <w:r>
+              <w:t>**What I Changed**</w:t>
+            </w:r>
+          </w:p>
+        </w:tc>
+        <w:tc>
+          <w:tcPr>
+            <w:tcW w:type="dxa" w:w="4320"/>
+          </w:tcPr>
+          <w:p>
+            <w:r>
+              <w:t>Added safe default (passed=true, score=7) on API failure; threshold set at score &gt;= 7</w:t>
+            </w:r>
+          </w:p>
+        </w:tc>
+      </w:tr>
+      <w:tr>
+        <w:tc>
+          <w:tcPr>
+            <w:tcW w:type="dxa" w:w="4320"/>
+          </w:tcPr>
+          <w:p>
+            <w:r>
+              <w:t>**Verification**</w:t>
+            </w:r>
+          </w:p>
+        </w:tc>
+        <w:tc>
+          <w:tcPr>
+            <w:tcW w:type="dxa" w:w="4320"/>
+          </w:tcPr>
+          <w:p>
+            <w:r>
+              <w:t>Compared QA scores with manual review; tested with intentionally problematic stories</w:t>
+            </w:r>
+          </w:p>
+        </w:tc>
+      </w:tr>
+    </w:tbl>
+    <w:p/>
+    <w:p>
+      <w:pPr>
+        <w:pStyle w:val="Heading3"/>
+      </w:pPr>
+      <w:r>
+        <w:t>Trace 3: Illustration Generation</w:t>
+      </w:r>
+    </w:p>
+    <w:tbl>
+      <w:tblPr>
+        <w:tblStyle w:val="TableGrid"/>
+        <w:tblW w:type="auto" w:w="0"/>
+        <w:tblLook w:firstColumn="1" w:firstRow="1" w:lastColumn="0" w:lastRow="0" w:noHBand="0" w:noVBand="1" w:val="04A0"/>
+      </w:tblPr>
+      <w:tblGrid>
+        <w:gridCol w:w="4320"/>
+        <w:gridCol w:w="4320"/>
+      </w:tblGrid>
+      <w:tr>
+        <w:tc>
+          <w:tcPr>
+            <w:tcW w:type="dxa" w:w="4320"/>
+          </w:tcPr>
+          <w:p>
+            <w:r>
+              <w:t>Field</w:t>
+            </w:r>
+          </w:p>
+        </w:tc>
+        <w:tc>
+          <w:tcPr>
+            <w:tcW w:type="dxa" w:w="4320"/>
+          </w:tcPr>
+          <w:p>
+            <w:r>
+              <w:t>Content</w:t>
+            </w:r>
+          </w:p>
+        </w:tc>
+      </w:tr>
+      <w:tr>
+        <w:tc>
+          <w:tcPr>
+            <w:tcW w:type="dxa" w:w="4320"/>
+          </w:tcPr>
+          <w:p>
+            <w:r>
+              <w:t>**Tool**</w:t>
+            </w:r>
+          </w:p>
+        </w:tc>
+        <w:tc>
+          <w:tcPr>
+            <w:tcW w:type="dxa" w:w="4320"/>
+          </w:tcPr>
+          <w:p>
+            <w:r>
+              <w:t>DALL-E 3 via OpenAI API</w:t>
+            </w:r>
+          </w:p>
+        </w:tc>
+      </w:tr>
+      <w:tr>
+        <w:tc>
+          <w:tcPr>
+            <w:tcW w:type="dxa" w:w="4320"/>
+          </w:tcPr>
+          <w:p>
+            <w:r>
+              <w:t>**What AI Generated**</w:t>
+            </w:r>
+          </w:p>
+        </w:tc>
+        <w:tc>
+          <w:tcPr>
+            <w:tcW w:type="dxa" w:w="4320"/>
+          </w:tcPr>
+          <w:p>
+            <w:r>
+              <w:t>1024x1024 watercolor-style children's book illustrations</w:t>
+            </w:r>
+          </w:p>
+        </w:tc>
+      </w:tr>
+      <w:tr>
+        <w:tc>
+          <w:tcPr>
+            <w:tcW w:type="dxa" w:w="4320"/>
+          </w:tcPr>
+          <w:p>
+            <w:r>
+              <w:t>**What I Changed**</w:t>
+            </w:r>
+          </w:p>
+        </w:tc>
+        <w:tc>
+          <w:tcPr>
+            <w:tcW w:type="dxa" w:w="4320"/>
+          </w:tcPr>
+          <w:p>
+            <w:r>
+              <w:t>Character description injection for consistency; coral/gold/sage palette to match UI</w:t>
+            </w:r>
+          </w:p>
+        </w:tc>
+      </w:tr>
+      <w:tr>
+        <w:tc>
+          <w:tcPr>
+            <w:tcW w:type="dxa" w:w="4320"/>
+          </w:tcPr>
+          <w:p>
+            <w:r>
+              <w:t>**Verification**</w:t>
+            </w:r>
+          </w:p>
+        </w:tc>
+        <w:tc>
+          <w:tcPr>
+            <w:tcW w:type="dxa" w:w="4320"/>
+          </w:tcPr>
+          <w:p>
+            <w:r>
+              <w:t>Visual inspection of 50+ illustrations for age-appropriateness and consistency</w:t>
+            </w:r>
+          </w:p>
+        </w:tc>
+      </w:tr>
+    </w:tbl>
+    <w:p/>
+    <w:p>
+      <w:pPr>
+        <w:pStyle w:val="Heading3"/>
+      </w:pPr>
+      <w:r>
+        <w:t>Trace 4: Test Scaffolding</w:t>
+      </w:r>
+    </w:p>
+    <w:tbl>
+      <w:tblPr>
+        <w:tblStyle w:val="TableGrid"/>
+        <w:tblW w:type="auto" w:w="0"/>
+        <w:tblLook w:firstColumn="1" w:firstRow="1" w:lastColumn="0" w:lastRow="0" w:noHBand="0" w:noVBand="1" w:val="04A0"/>
+      </w:tblPr>
+      <w:tblGrid>
+        <w:gridCol w:w="4320"/>
+        <w:gridCol w:w="4320"/>
+      </w:tblGrid>
+      <w:tr>
+        <w:tc>
+          <w:tcPr>
+            <w:tcW w:type="dxa" w:w="4320"/>
+          </w:tcPr>
+          <w:p>
+            <w:r>
+              <w:t>Field</w:t>
+            </w:r>
+          </w:p>
+        </w:tc>
+        <w:tc>
+          <w:tcPr>
+            <w:tcW w:type="dxa" w:w="4320"/>
+          </w:tcPr>
+          <w:p>
+            <w:r>
+              <w:t>Content</w:t>
+            </w:r>
+          </w:p>
+        </w:tc>
+      </w:tr>
+      <w:tr>
+        <w:tc>
+          <w:tcPr>
+            <w:tcW w:type="dxa" w:w="4320"/>
+          </w:tcPr>
+          <w:p>
+            <w:r>
+              <w:t>**Tool**</w:t>
+            </w:r>
+          </w:p>
+        </w:tc>
+        <w:tc>
+          <w:tcPr>
+            <w:tcW w:type="dxa" w:w="4320"/>
+          </w:tcPr>
+          <w:p>
+            <w:r>
+              <w:t>Goose AI Agent (Block) with Claude</w:t>
+            </w:r>
+          </w:p>
+        </w:tc>
+      </w:tr>
+      <w:tr>
+        <w:tc>
+          <w:tcPr>
+            <w:tcW w:type="dxa" w:w="4320"/>
+          </w:tcPr>
+          <w:p>
+            <w:r>
+              <w:t>**What AI Generated**</w:t>
+            </w:r>
+          </w:p>
+        </w:tc>
+        <w:tc>
+          <w:tcPr>
+            <w:tcW w:type="dxa" w:w="4320"/>
+          </w:tcPr>
+          <w:p>
+            <w:r>
+              <w:t>pytest fixtures, test structure, mock configurations</w:t>
+            </w:r>
+          </w:p>
+        </w:tc>
+      </w:tr>
+      <w:tr>
+        <w:tc>
+          <w:tcPr>
+            <w:tcW w:type="dxa" w:w="4320"/>
+          </w:tcPr>
+          <w:p>
+            <w:r>
+              <w:t>**What I Changed**</w:t>
+            </w:r>
+          </w:p>
+        </w:tc>
+        <w:tc>
+          <w:tcPr>
+            <w:tcW w:type="dxa" w:w="4320"/>
+          </w:tcPr>
+          <w:p>
+            <w:r>
+              <w:t>Fixed mock data structures; simplified SSE streaming tests</w:t>
+            </w:r>
+          </w:p>
+        </w:tc>
+      </w:tr>
+      <w:tr>
+        <w:tc>
+          <w:tcPr>
+            <w:tcW w:type="dxa" w:w="4320"/>
+          </w:tcPr>
+          <w:p>
+            <w:r>
+              <w:t>**Verification**</w:t>
+            </w:r>
+          </w:p>
+        </w:tc>
+        <w:tc>
+          <w:tcPr>
+            <w:tcW w:type="dxa" w:w="4320"/>
+          </w:tcPr>
+          <w:p>
+            <w:r>
+              <w:t>151 backend tests passing; 24 frontend tests passing</w:t>
+            </w:r>
+          </w:p>
+        </w:tc>
+      </w:tr>
+    </w:tbl>
+    <w:p/>
+    <w:p>
+      <w:pPr>
+        <w:pStyle w:val="Heading3"/>
+      </w:pPr>
+      <w:r>
+        <w:t>Trace 5: Knowledge Base Curation</w:t>
+      </w:r>
+    </w:p>
+    <w:tbl>
+      <w:tblPr>
+        <w:tblStyle w:val="TableGrid"/>
+        <w:tblW w:type="auto" w:w="0"/>
+        <w:tblLook w:firstColumn="1" w:firstRow="1" w:lastColumn="0" w:lastRow="0" w:noHBand="0" w:noVBand="1" w:val="04A0"/>
+      </w:tblPr>
+      <w:tblGrid>
+        <w:gridCol w:w="4320"/>
+        <w:gridCol w:w="4320"/>
+      </w:tblGrid>
+      <w:tr>
+        <w:tc>
+          <w:tcPr>
+            <w:tcW w:type="dxa" w:w="4320"/>
+          </w:tcPr>
+          <w:p>
+            <w:r>
+              <w:t>Field</w:t>
+            </w:r>
+          </w:p>
+        </w:tc>
+        <w:tc>
+          <w:tcPr>
+            <w:tcW w:type="dxa" w:w="4320"/>
+          </w:tcPr>
+          <w:p>
+            <w:r>
+              <w:t>Content</w:t>
+            </w:r>
+          </w:p>
+        </w:tc>
+      </w:tr>
+      <w:tr>
+        <w:tc>
+          <w:tcPr>
+            <w:tcW w:type="dxa" w:w="4320"/>
+          </w:tcPr>
+          <w:p>
+            <w:r>
+              <w:t>**Tool**</w:t>
+            </w:r>
+          </w:p>
+        </w:tc>
+        <w:tc>
+          <w:tcPr>
+            <w:tcW w:type="dxa" w:w="4320"/>
+          </w:tcPr>
+          <w:p>
+            <w:r>
+              <w:t>Goose AI Agent (Block) with Claude</w:t>
+            </w:r>
+          </w:p>
+        </w:tc>
+      </w:tr>
+      <w:tr>
+        <w:tc>
+          <w:tcPr>
+            <w:tcW w:type="dxa" w:w="4320"/>
+          </w:tcPr>
+          <w:p>
+            <w:r>
+              <w:t>**What AI Generated**</w:t>
+            </w:r>
+          </w:p>
+        </w:tc>
+        <w:tc>
+          <w:tcPr>
+            <w:tcW w:type="dxa" w:w="4320"/>
+          </w:tcPr>
+          <w:p>
+            <w:r>
+              <w:t>Initial list of 50 women with categories, achievements, story angles</w:t>
+            </w:r>
+          </w:p>
+        </w:tc>
+      </w:tr>
+      <w:tr>
+        <w:tc>
+          <w:tcPr>
+            <w:tcW w:type="dxa" w:w="4320"/>
+          </w:tcPr>
+          <w:p>
+            <w:r>
+              <w:t>**What I Changed**</w:t>
+            </w:r>
+          </w:p>
+        </w:tc>
+        <w:tc>
+          <w:tcPr>
+            <w:tcW w:type="dxa" w:w="4320"/>
+          </w:tcPr>
+          <w:p>
+            <w:r>
+              <w:t>Verified every fact against Wikipedia/Britannica; rewrote for age-appropriateness</w:t>
+            </w:r>
+          </w:p>
+        </w:tc>
+      </w:tr>
+      <w:tr>
+        <w:tc>
+          <w:tcPr>
+            <w:tcW w:type="dxa" w:w="4320"/>
+          </w:tcPr>
+          <w:p>
+            <w:r>
+              <w:t>**Verification**</w:t>
+            </w:r>
+          </w:p>
+        </w:tc>
+        <w:tc>
+          <w:tcPr>
+            <w:tcW w:type="dxa" w:w="4320"/>
+          </w:tcPr>
+          <w:p>
+            <w:r>
+              <w:t>Cross-referenced each achievement with 2+ historical sources</w:t>
+            </w:r>
+          </w:p>
+        </w:tc>
+      </w:tr>
+    </w:tbl>
+    <w:p/>
+    <w:p>
+      <w:r>
+        <w:t>[Full AI Trace Log →](docs/AI_TRACE_LOG.md)</w:t>
+      </w:r>
+    </w:p>
+    <w:p/>
+    <w:p>
+      <w:r>
+        <w:t>──────────────────────────────────────────────────</w:t>
+      </w:r>
+    </w:p>
+    <w:p/>
+    <w:p>
+      <w:pPr>
+        <w:pStyle w:val="Heading2"/>
+      </w:pPr>
+      <w:r>
+        <w:t>Risk Log</w:t>
+      </w:r>
+    </w:p>
+    <w:p/>
+    <w:tbl>
+      <w:tblPr>
+        <w:tblStyle w:val="TableGrid"/>
+        <w:tblW w:type="auto" w:w="0"/>
+        <w:tblLook w:firstColumn="1" w:firstRow="1" w:lastColumn="0" w:lastRow="0" w:noHBand="0" w:noVBand="1" w:val="04A0"/>
+      </w:tblPr>
+      <w:tblGrid>
+        <w:gridCol w:w="2160"/>
+        <w:gridCol w:w="2160"/>
+        <w:gridCol w:w="2160"/>
+        <w:gridCol w:w="2160"/>
+      </w:tblGrid>
+      <w:tr>
+        <w:tc>
+          <w:tcPr>
+            <w:tcW w:type="dxa" w:w="2160"/>
+          </w:tcPr>
+          <w:p>
+            <w:r>
+              <w:t>Risk</w:t>
+            </w:r>
+          </w:p>
+        </w:tc>
+        <w:tc>
+          <w:tcPr>
+            <w:tcW w:type="dxa" w:w="2160"/>
+          </w:tcPr>
+          <w:p>
+            <w:r>
+              <w:t>Severity</w:t>
+            </w:r>
+          </w:p>
+        </w:tc>
+        <w:tc>
+          <w:tcPr>
+            <w:tcW w:type="dxa" w:w="2160"/>
+          </w:tcPr>
+          <w:p>
+            <w:r>
+              <w:t>Mitigation</w:t>
+            </w:r>
+          </w:p>
+        </w:tc>
+        <w:tc>
+          <w:tcPr>
+            <w:tcW w:type="dxa" w:w="2160"/>
+          </w:tcPr>
+          <w:p>
+            <w:r>
+              <w:t>Status</w:t>
+            </w:r>
+          </w:p>
+        </w:tc>
+      </w:tr>
+      <w:tr>
+        <w:tc>
+          <w:tcPr>
+            <w:tcW w:type="dxa" w:w="2160"/>
+          </w:tcPr>
+          <w:p>
+            <w:r>
+              <w:t>**API keys hardcoded**</w:t>
+            </w:r>
+          </w:p>
+        </w:tc>
+        <w:tc>
+          <w:tcPr>
+            <w:tcW w:type="dxa" w:w="2160"/>
+          </w:tcPr>
+          <w:p>
+            <w:r>
+              <w:t>Critical</w:t>
+            </w:r>
+          </w:p>
+        </w:tc>
+        <w:tc>
+          <w:tcPr>
+            <w:tcW w:type="dxa" w:w="2160"/>
+          </w:tcPr>
+          <w:p>
+            <w:r>
+              <w:t>Moved to `.env`; added to `.gitignore`; created `.env.example`</w:t>
+            </w:r>
+          </w:p>
+        </w:tc>
+        <w:tc>
+          <w:tcPr>
+            <w:tcW w:type="dxa" w:w="2160"/>
+          </w:tcPr>
+          <w:p>
+            <w:r>
+              <w:t>✅ Fixed</w:t>
+            </w:r>
+          </w:p>
+        </w:tc>
+      </w:tr>
+      <w:tr>
+        <w:tc>
+          <w:tcPr>
+            <w:tcW w:type="dxa" w:w="2160"/>
+          </w:tcPr>
+          <w:p>
+            <w:r>
+              <w:t>**AI amplifies stereotypes**</w:t>
+            </w:r>
+          </w:p>
+        </w:tc>
+        <w:tc>
+          <w:tcPr>
+            <w:tcW w:type="dxa" w:w="2160"/>
+          </w:tcPr>
+          <w:p>
+            <w:r>
+              <w:t>Major</w:t>
+            </w:r>
+          </w:p>
+        </w:tc>
+        <w:tc>
+          <w:tcPr>
+            <w:tcW w:type="dxa" w:w="2160"/>
+          </w:tcPr>
+          <w:p>
+            <w:r>
+              <w:t>QA verification loop detects reinforcement; stories must score 7+/10</w:t>
+            </w:r>
+          </w:p>
+        </w:tc>
+        <w:tc>
+          <w:tcPr>
+            <w:tcW w:type="dxa" w:w="2160"/>
+          </w:tcPr>
+          <w:p>
+            <w:r>
+              <w:t>✅ Fixed</w:t>
+            </w:r>
+          </w:p>
+        </w:tc>
+      </w:tr>
+      <w:tr>
+        <w:tc>
+          <w:tcPr>
+            <w:tcW w:type="dxa" w:w="2160"/>
+          </w:tcPr>
+          <w:p>
+            <w:r>
+              <w:t>**150s generation time**</w:t>
+            </w:r>
+          </w:p>
+        </w:tc>
+        <w:tc>
+          <w:tcPr>
+            <w:tcW w:type="dxa" w:w="2160"/>
+          </w:tcPr>
+          <w:p>
+            <w:r>
+              <w:t>Major</w:t>
+            </w:r>
+          </w:p>
+        </w:tc>
+        <w:tc>
+          <w:tcPr>
+            <w:tcW w:type="dxa" w:w="2160"/>
+          </w:tcPr>
+          <w:p>
+            <w:r>
+              <w:t>Parallel execution with ThreadPoolExecutor; reduced to ~75s</w:t>
+            </w:r>
+          </w:p>
+        </w:tc>
+        <w:tc>
+          <w:tcPr>
+            <w:tcW w:type="dxa" w:w="2160"/>
+          </w:tcPr>
+          <w:p>
+            <w:r>
+              <w:t>✅ Fixed</w:t>
+            </w:r>
+          </w:p>
+        </w:tc>
+      </w:tr>
+      <w:tr>
+        <w:tc>
+          <w:tcPr>
+            <w:tcW w:type="dxa" w:w="2160"/>
+          </w:tcPr>
+          <w:p>
+            <w:r>
+              <w:t>**AI hallucinating facts**</w:t>
+            </w:r>
+          </w:p>
+        </w:tc>
+        <w:tc>
+          <w:tcPr>
+            <w:tcW w:type="dxa" w:w="2160"/>
+          </w:tcPr>
+          <w:p>
+            <w:r>
+              <w:t>Major</w:t>
+            </w:r>
+          </w:p>
+        </w:tc>
+        <w:tc>
+          <w:tcPr>
+            <w:tcW w:type="dxa" w:w="2160"/>
+          </w:tcPr>
+          <w:p>
+            <w:r>
+              <w:t>50 women manually verified against Wikipedia/Britannica</w:t>
+            </w:r>
+          </w:p>
+        </w:tc>
+        <w:tc>
+          <w:tcPr>
+            <w:tcW w:type="dxa" w:w="2160"/>
+          </w:tcPr>
+          <w:p>
+            <w:r>
+              <w:t>✅ Fixed</w:t>
+            </w:r>
+          </w:p>
+        </w:tc>
+      </w:tr>
+      <w:tr>
+        <w:tc>
+          <w:tcPr>
+            <w:tcW w:type="dxa" w:w="2160"/>
+          </w:tcPr>
+          <w:p>
+            <w:r>
+              <w:t>**Character inconsistency**</w:t>
+            </w:r>
+          </w:p>
+        </w:tc>
+        <w:tc>
+          <w:tcPr>
+            <w:tcW w:type="dxa" w:w="2160"/>
+          </w:tcPr>
+          <w:p>
+            <w:r>
+              <w:t>Major</w:t>
+            </w:r>
+          </w:p>
+        </w:tc>
+        <w:tc>
+          <w:tcPr>
+            <w:tcW w:type="dxa" w:w="2160"/>
+          </w:tcPr>
+          <w:p>
+            <w:r>
+              <w:t>Detailed character description injected into every DALL-E prompt</w:t>
+            </w:r>
+          </w:p>
+        </w:tc>
+        <w:tc>
+          <w:tcPr>
+            <w:tcW w:type="dxa" w:w="2160"/>
+          </w:tcPr>
+          <w:p>
+            <w:r>
+              <w:t>✅ Fixed</w:t>
+            </w:r>
+          </w:p>
+        </w:tc>
+      </w:tr>
+      <w:tr>
+        <w:tc>
+          <w:tcPr>
+            <w:tcW w:type="dxa" w:w="2160"/>
+          </w:tcPr>
+          <w:p>
+            <w:r>
+              <w:t>**Privacy concerns**</w:t>
+            </w:r>
+          </w:p>
+        </w:tc>
+        <w:tc>
+          <w:tcPr>
+            <w:tcW w:type="dxa" w:w="2160"/>
+          </w:tcPr>
+          <w:p>
+            <w:r>
+              <w:t>Minor</w:t>
+            </w:r>
+          </w:p>
+        </w:tc>
+        <w:tc>
+          <w:tcPr>
+            <w:tcW w:type="dxa" w:w="2160"/>
+          </w:tcPr>
+          <w:p>
+            <w:r>
+              <w:t>No database, no login, no cookies — session-only data</w:t>
+            </w:r>
+          </w:p>
+        </w:tc>
+        <w:tc>
+          <w:tcPr>
+            <w:tcW w:type="dxa" w:w="2160"/>
+          </w:tcPr>
+          <w:p>
+            <w:r>
+              <w:t>✅ Fixed</w:t>
+            </w:r>
+          </w:p>
+        </w:tc>
+      </w:tr>
+      <w:tr>
+        <w:tc>
+          <w:tcPr>
+            <w:tcW w:type="dxa" w:w="2160"/>
+          </w:tcPr>
+          <w:p>
+            <w:r>
+              <w:t>**WCAG AA compliance**</w:t>
+            </w:r>
+          </w:p>
+        </w:tc>
+        <w:tc>
+          <w:tcPr>
+            <w:tcW w:type="dxa" w:w="2160"/>
+          </w:tcPr>
+          <w:p>
+            <w:r>
+              <w:t>Minor</w:t>
+            </w:r>
+          </w:p>
+        </w:tc>
+        <w:tc>
+          <w:tcPr>
+            <w:tcW w:type="dxa" w:w="2160"/>
+          </w:tcPr>
+          <w:p>
+            <w:r>
+              <w:t>Color contrast 4.5:1+ (#6B605A text, #C4594B buttons); ARIA labels; keyboard nav</w:t>
+            </w:r>
+          </w:p>
+        </w:tc>
+        <w:tc>
+          <w:tcPr>
+            <w:tcW w:type="dxa" w:w="2160"/>
+          </w:tcPr>
+          <w:p>
+            <w:r>
+              <w:t>✅ Fixed</w:t>
+            </w:r>
+          </w:p>
+        </w:tc>
+      </w:tr>
+      <w:tr>
+        <w:tc>
+          <w:tcPr>
+            <w:tcW w:type="dxa" w:w="2160"/>
+          </w:tcPr>
+          <w:p>
+            <w:r>
+              <w:t>**DALL-E URLs expire**</w:t>
+            </w:r>
+          </w:p>
+        </w:tc>
+        <w:tc>
+          <w:tcPr>
+            <w:tcW w:type="dxa" w:w="2160"/>
+          </w:tcPr>
+          <w:p>
+            <w:r>
+              <w:t>Minor</w:t>
+            </w:r>
+          </w:p>
+        </w:tc>
+        <w:tc>
+          <w:tcPr>
+            <w:tcW w:type="dxa" w:w="2160"/>
+          </w:tcPr>
+          <w:p>
+            <w:r>
+              <w:t>Acceptable for demo; would need S3/Cloudinary for production</w:t>
+            </w:r>
+          </w:p>
+        </w:tc>
+        <w:tc>
+          <w:tcPr>
+            <w:tcW w:type="dxa" w:w="2160"/>
+          </w:tcPr>
+          <w:p>
+            <w:r>
+              <w:t>Documented</w:t>
+            </w:r>
+          </w:p>
+        </w:tc>
+      </w:tr>
+    </w:tbl>
+    <w:p/>
+    <w:p>
+      <w:r>
+        <w:t>[Full Risk Log →](docs/RISK_LOG.md)</w:t>
+      </w:r>
+    </w:p>
+    <w:p/>
+    <w:p>
+      <w:r>
+        <w:t>──────────────────────────────────────────────────</w:t>
+      </w:r>
+    </w:p>
+    <w:p/>
+    <w:p>
+      <w:pPr>
+        <w:pStyle w:val="Heading2"/>
+      </w:pPr>
+      <w:r>
+        <w:t>Evidence Log</w:t>
+      </w:r>
+    </w:p>
+    <w:p/>
+    <w:p>
+      <w:pPr>
+        <w:pStyle w:val="Heading3"/>
+      </w:pPr>
+      <w:r>
+        <w:t>Research Sources</w:t>
+      </w:r>
+    </w:p>
+    <w:p/>
+    <w:tbl>
+      <w:tblPr>
+        <w:tblStyle w:val="TableGrid"/>
+        <w:tblW w:type="auto" w:w="0"/>
+        <w:tblLook w:firstColumn="1" w:firstRow="1" w:lastColumn="0" w:lastRow="0" w:noHBand="0" w:noVBand="1" w:val="04A0"/>
+      </w:tblPr>
+      <w:tblGrid>
+        <w:gridCol w:w="2160"/>
+        <w:gridCol w:w="2160"/>
+        <w:gridCol w:w="2160"/>
+        <w:gridCol w:w="2160"/>
+      </w:tblGrid>
+      <w:tr>
+        <w:tc>
+          <w:tcPr>
+            <w:tcW w:type="dxa" w:w="2160"/>
+          </w:tcPr>
+          <w:p>
+            <w:r>
+              <w:t>#</w:t>
+            </w:r>
+          </w:p>
+        </w:tc>
+        <w:tc>
+          <w:tcPr>
+            <w:tcW w:type="dxa" w:w="2160"/>
+          </w:tcPr>
+          <w:p>
+            <w:r>
+              <w:t>Claim</w:t>
+            </w:r>
+          </w:p>
+        </w:tc>
+        <w:tc>
+          <w:tcPr>
+            <w:tcW w:type="dxa" w:w="2160"/>
+          </w:tcPr>
+          <w:p>
+            <w:r>
+              <w:t>Source</w:t>
+            </w:r>
+          </w:p>
+        </w:tc>
+        <w:tc>
+          <w:tcPr>
+            <w:tcW w:type="dxa" w:w="2160"/>
+          </w:tcPr>
+          <w:p>
+            <w:r>
+              <w:t>Type</w:t>
+            </w:r>
+          </w:p>
+        </w:tc>
+      </w:tr>
+      <w:tr>
+        <w:tc>
+          <w:tcPr>
+            <w:tcW w:type="dxa" w:w="2160"/>
+          </w:tcPr>
+          <w:p>
+            <w:r>
+              <w:t>1</w:t>
+            </w:r>
+          </w:p>
+        </w:tc>
+        <w:tc>
+          <w:tcPr>
+            <w:tcW w:type="dxa" w:w="2160"/>
+          </w:tcPr>
+          <w:p>
+            <w:r>
+              <w:t>"Children absorb stereotypes by age 3"</w:t>
+            </w:r>
+          </w:p>
+        </w:tc>
+        <w:tc>
+          <w:tcPr>
+            <w:tcW w:type="dxa" w:w="2160"/>
+          </w:tcPr>
+          <w:p>
+            <w:r>
+              <w:t>Bian et al. (2017). *Science*, 355(6323). DOI: 10.1126/science.aah6524</w:t>
+            </w:r>
+          </w:p>
+        </w:tc>
+        <w:tc>
+          <w:tcPr>
+            <w:tcW w:type="dxa" w:w="2160"/>
+          </w:tcPr>
+          <w:p>
+            <w:r>
+              <w:t>Academic</w:t>
+            </w:r>
+          </w:p>
+        </w:tc>
+      </w:tr>
+      <w:tr>
+        <w:tc>
+          <w:tcPr>
+            <w:tcW w:type="dxa" w:w="2160"/>
+          </w:tcPr>
+          <w:p>
+            <w:r>
+              <w:t>2</w:t>
+            </w:r>
+          </w:p>
+        </w:tc>
+        <w:tc>
+          <w:tcPr>
+            <w:tcW w:type="dxa" w:w="2160"/>
+          </w:tcPr>
+          <w:p>
+            <w:r>
+              <w:t>"By age 6, girls believe boys are smarter"</w:t>
+            </w:r>
+          </w:p>
+        </w:tc>
+        <w:tc>
+          <w:tcPr>
+            <w:tcW w:type="dxa" w:w="2160"/>
+          </w:tcPr>
+          <w:p>
+            <w:r>
+              <w:t>Same study (Bian et al., 2017)</w:t>
+            </w:r>
+          </w:p>
+        </w:tc>
+        <w:tc>
+          <w:tcPr>
+            <w:tcW w:type="dxa" w:w="2160"/>
+          </w:tcPr>
+          <w:p>
+            <w:r>
+              <w:t>Academic</w:t>
+            </w:r>
+          </w:p>
+        </w:tc>
+      </w:tr>
+      <w:tr>
+        <w:tc>
+          <w:tcPr>
+            <w:tcW w:type="dxa" w:w="2160"/>
+          </w:tcPr>
+          <w:p>
+            <w:r>
+              <w:t>3</w:t>
+            </w:r>
+          </w:p>
+        </w:tc>
+        <w:tc>
+          <w:tcPr>
+            <w:tcW w:type="dxa" w:w="2160"/>
+          </w:tcPr>
+          <w:p>
+            <w:r>
+              <w:t>"Counter-stereotypical content shifts attitudes"</w:t>
+            </w:r>
+          </w:p>
+        </w:tc>
+        <w:tc>
+          <w:tcPr>
+            <w:tcW w:type="dxa" w:w="2160"/>
+          </w:tcPr>
+          <w:p>
+            <w:r>
+              <w:t>Master et al. (2016). *J. Educational Psychology*, 108(3). DOI: 10.1037/edu0000061</w:t>
+            </w:r>
+          </w:p>
+        </w:tc>
+        <w:tc>
+          <w:tcPr>
+            <w:tcW w:type="dxa" w:w="2160"/>
+          </w:tcPr>
+          <w:p>
+            <w:r>
+              <w:t>Academic</w:t>
+            </w:r>
+          </w:p>
+        </w:tc>
+      </w:tr>
+      <w:tr>
+        <w:tc>
+          <w:tcPr>
+            <w:tcW w:type="dxa" w:w="2160"/>
+          </w:tcPr>
+          <w:p>
+            <w:r>
+              <w:t>4</w:t>
+            </w:r>
+          </w:p>
+        </w:tc>
+        <w:tc>
+          <w:tcPr>
+            <w:tcW w:type="dxa" w:w="2160"/>
+          </w:tcPr>
+          <w:p>
+            <w:r>
+              <w:t>"AI-generated stories amplify stereotypes 55% more"</w:t>
+            </w:r>
+          </w:p>
+        </w:tc>
+        <w:tc>
+          <w:tcPr>
+            <w:tcW w:type="dxa" w:w="2160"/>
+          </w:tcPr>
+          <w:p>
+            <w:r>
+              <w:t>EMNLP 2025 research on AI bias</w:t>
+            </w:r>
+          </w:p>
+        </w:tc>
+        <w:tc>
+          <w:tcPr>
+            <w:tcW w:type="dxa" w:w="2160"/>
+          </w:tcPr>
+          <w:p>
+            <w:r>
+              <w:t>Academic</w:t>
+            </w:r>
+          </w:p>
+        </w:tc>
+      </w:tr>
+    </w:tbl>
+    <w:p/>
+    <w:p>
+      <w:pPr>
+        <w:pStyle w:val="Heading3"/>
+      </w:pPr>
+      <w:r>
+        <w:t>Code Dependencies</w:t>
+      </w:r>
+    </w:p>
+    <w:p/>
+    <w:tbl>
+      <w:tblPr>
+        <w:tblStyle w:val="TableGrid"/>
+        <w:tblW w:type="auto" w:w="0"/>
+        <w:tblLook w:firstColumn="1" w:firstRow="1" w:lastColumn="0" w:lastRow="0" w:noHBand="0" w:noVBand="1" w:val="04A0"/>
+      </w:tblPr>
+      <w:tblGrid>
+        <w:gridCol w:w="2160"/>
+        <w:gridCol w:w="2160"/>
+        <w:gridCol w:w="2160"/>
+        <w:gridCol w:w="2160"/>
+      </w:tblGrid>
+      <w:tr>
+        <w:tc>
+          <w:tcPr>
+            <w:tcW w:type="dxa" w:w="2160"/>
+          </w:tcPr>
+          <w:p>
+            <w:r>
+              <w:t>#</w:t>
+            </w:r>
+          </w:p>
+        </w:tc>
+        <w:tc>
+          <w:tcPr>
+            <w:tcW w:type="dxa" w:w="2160"/>
+          </w:tcPr>
+          <w:p>
+            <w:r>
+              <w:t>Package</w:t>
+            </w:r>
+          </w:p>
+        </w:tc>
+        <w:tc>
+          <w:tcPr>
+            <w:tcW w:type="dxa" w:w="2160"/>
+          </w:tcPr>
+          <w:p>
+            <w:r>
+              <w:t>License</w:t>
+            </w:r>
+          </w:p>
+        </w:tc>
+        <w:tc>
+          <w:tcPr>
+            <w:tcW w:type="dxa" w:w="2160"/>
+          </w:tcPr>
+          <w:p>
+            <w:r>
+              <w:t>Link</w:t>
+            </w:r>
+          </w:p>
+        </w:tc>
+      </w:tr>
+      <w:tr>
+        <w:tc>
+          <w:tcPr>
+            <w:tcW w:type="dxa" w:w="2160"/>
+          </w:tcPr>
+          <w:p>
+            <w:r>
+              <w:t>5</w:t>
+            </w:r>
+          </w:p>
+        </w:tc>
+        <w:tc>
+          <w:tcPr>
+            <w:tcW w:type="dxa" w:w="2160"/>
+          </w:tcPr>
+          <w:p>
+            <w:r>
+              <w:t>React</w:t>
+            </w:r>
+          </w:p>
+        </w:tc>
+        <w:tc>
+          <w:tcPr>
+            <w:tcW w:type="dxa" w:w="2160"/>
+          </w:tcPr>
+          <w:p>
+            <w:r>
+              <w:t>MIT</w:t>
+            </w:r>
+          </w:p>
+        </w:tc>
+        <w:tc>
+          <w:tcPr>
+            <w:tcW w:type="dxa" w:w="2160"/>
+          </w:tcPr>
+          <w:p>
+            <w:r>
+              <w:t>https://react.dev</w:t>
+            </w:r>
+          </w:p>
+        </w:tc>
+      </w:tr>
+      <w:tr>
+        <w:tc>
+          <w:tcPr>
+            <w:tcW w:type="dxa" w:w="2160"/>
+          </w:tcPr>
+          <w:p>
+            <w:r>
+              <w:t>6</w:t>
+            </w:r>
+          </w:p>
+        </w:tc>
+        <w:tc>
+          <w:tcPr>
+            <w:tcW w:type="dxa" w:w="2160"/>
+          </w:tcPr>
+          <w:p>
+            <w:r>
+              <w:t>Flask</w:t>
+            </w:r>
+          </w:p>
+        </w:tc>
+        <w:tc>
+          <w:tcPr>
+            <w:tcW w:type="dxa" w:w="2160"/>
+          </w:tcPr>
+          <w:p>
+            <w:r>
+              <w:t>BSD-3-Clause</w:t>
+            </w:r>
+          </w:p>
+        </w:tc>
+        <w:tc>
+          <w:tcPr>
+            <w:tcW w:type="dxa" w:w="2160"/>
+          </w:tcPr>
+          <w:p>
+            <w:r>
+              <w:t>https://flask.palletsprojects.com</w:t>
+            </w:r>
+          </w:p>
+        </w:tc>
+      </w:tr>
+      <w:tr>
+        <w:tc>
+          <w:tcPr>
+            <w:tcW w:type="dxa" w:w="2160"/>
+          </w:tcPr>
+          <w:p>
+            <w:r>
+              <w:t>7</w:t>
+            </w:r>
+          </w:p>
+        </w:tc>
+        <w:tc>
+          <w:tcPr>
+            <w:tcW w:type="dxa" w:w="2160"/>
+          </w:tcPr>
+          <w:p>
+            <w:r>
+              <w:t>FastMCP</w:t>
+            </w:r>
+          </w:p>
+        </w:tc>
+        <w:tc>
+          <w:tcPr>
+            <w:tcW w:type="dxa" w:w="2160"/>
+          </w:tcPr>
+          <w:p>
+            <w:r>
+              <w:t>MIT</w:t>
+            </w:r>
+          </w:p>
+        </w:tc>
+        <w:tc>
+          <w:tcPr>
+            <w:tcW w:type="dxa" w:w="2160"/>
+          </w:tcPr>
+          <w:p>
+            <w:r>
+              <w:t>https://github.com/jlowin/fastmcp</w:t>
+            </w:r>
+          </w:p>
+        </w:tc>
+      </w:tr>
+      <w:tr>
+        <w:tc>
+          <w:tcPr>
+            <w:tcW w:type="dxa" w:w="2160"/>
+          </w:tcPr>
+          <w:p>
+            <w:r>
+              <w:t>8</w:t>
+            </w:r>
+          </w:p>
+        </w:tc>
+        <w:tc>
+          <w:tcPr>
+            <w:tcW w:type="dxa" w:w="2160"/>
+          </w:tcPr>
+          <w:p>
+            <w:r>
+              <w:t>OpenAI SDK</w:t>
+            </w:r>
+          </w:p>
+        </w:tc>
+        <w:tc>
+          <w:tcPr>
+            <w:tcW w:type="dxa" w:w="2160"/>
+          </w:tcPr>
+          <w:p>
+            <w:r>
+              <w:t>MIT</w:t>
+            </w:r>
+          </w:p>
+        </w:tc>
+        <w:tc>
+          <w:tcPr>
+            <w:tcW w:type="dxa" w:w="2160"/>
+          </w:tcPr>
+          <w:p>
+            <w:r>
+              <w:t>https://github.com/openai/openai-python</w:t>
+            </w:r>
+          </w:p>
+        </w:tc>
+      </w:tr>
+      <w:tr>
+        <w:tc>
+          <w:tcPr>
+            <w:tcW w:type="dxa" w:w="2160"/>
+          </w:tcPr>
+          <w:p>
+            <w:r>
+              <w:t>9</w:t>
+            </w:r>
+          </w:p>
+        </w:tc>
+        <w:tc>
+          <w:tcPr>
+            <w:tcW w:type="dxa" w:w="2160"/>
+          </w:tcPr>
+          <w:p>
+            <w:r>
+              <w:t>Goose</w:t>
+            </w:r>
+          </w:p>
+        </w:tc>
+        <w:tc>
+          <w:tcPr>
+            <w:tcW w:type="dxa" w:w="2160"/>
+          </w:tcPr>
+          <w:p>
+            <w:r>
+              <w:t>Apache 2.0</w:t>
+            </w:r>
+          </w:p>
+        </w:tc>
+        <w:tc>
+          <w:tcPr>
+            <w:tcW w:type="dxa" w:w="2160"/>
+          </w:tcPr>
+          <w:p>
+            <w:r>
+              <w:t>https://github.com/block/goose</w:t>
+            </w:r>
+          </w:p>
+        </w:tc>
+      </w:tr>
+      <w:tr>
+        <w:tc>
+          <w:tcPr>
+            <w:tcW w:type="dxa" w:w="2160"/>
+          </w:tcPr>
+          <w:p>
+            <w:r>
+              <w:t>10</w:t>
+            </w:r>
+          </w:p>
+        </w:tc>
+        <w:tc>
+          <w:tcPr>
+            <w:tcW w:type="dxa" w:w="2160"/>
+          </w:tcPr>
+          <w:p>
+            <w:r>
+              <w:t>Quicksand Font</w:t>
+            </w:r>
+          </w:p>
+        </w:tc>
+        <w:tc>
+          <w:tcPr>
+            <w:tcW w:type="dxa" w:w="2160"/>
+          </w:tcPr>
+          <w:p>
+            <w:r>
+              <w:t>SIL OFL</w:t>
+            </w:r>
+          </w:p>
+        </w:tc>
+        <w:tc>
+          <w:tcPr>
+            <w:tcW w:type="dxa" w:w="2160"/>
+          </w:tcPr>
+          <w:p>
+            <w:r>
+              <w:t>https://fonts.google.com/specimen/Quicksand</w:t>
+            </w:r>
+          </w:p>
+        </w:tc>
+      </w:tr>
+      <w:tr>
+        <w:tc>
+          <w:tcPr>
+            <w:tcW w:type="dxa" w:w="2160"/>
+          </w:tcPr>
+          <w:p>
+            <w:r>
+              <w:t>11</w:t>
+            </w:r>
+          </w:p>
+        </w:tc>
+        <w:tc>
+          <w:tcPr>
+            <w:tcW w:type="dxa" w:w="2160"/>
+          </w:tcPr>
+          <w:p>
+            <w:r>
+              <w:t>DM Sans Font</w:t>
+            </w:r>
+          </w:p>
+        </w:tc>
+        <w:tc>
+          <w:tcPr>
+            <w:tcW w:type="dxa" w:w="2160"/>
+          </w:tcPr>
+          <w:p>
+            <w:r>
+              <w:t>SIL OFL</w:t>
+            </w:r>
+          </w:p>
+        </w:tc>
+        <w:tc>
+          <w:tcPr>
+            <w:tcW w:type="dxa" w:w="2160"/>
+          </w:tcPr>
+          <w:p>
+            <w:r>
+              <w:t>https://fonts.google.com/specimen/DM+Sans</w:t>
+            </w:r>
+          </w:p>
+        </w:tc>
+      </w:tr>
+      <w:tr>
+        <w:tc>
+          <w:tcPr>
+            <w:tcW w:type="dxa" w:w="2160"/>
+          </w:tcPr>
+          <w:p>
+            <w:r>
+              <w:t>12</w:t>
+            </w:r>
+          </w:p>
+        </w:tc>
+        <w:tc>
+          <w:tcPr>
+            <w:tcW w:type="dxa" w:w="2160"/>
+          </w:tcPr>
+          <w:p>
+            <w:r>
+              <w:t>Caveat Font</w:t>
+            </w:r>
+          </w:p>
+        </w:tc>
+        <w:tc>
+          <w:tcPr>
+            <w:tcW w:type="dxa" w:w="2160"/>
+          </w:tcPr>
+          <w:p>
+            <w:r>
+              <w:t>SIL OFL</w:t>
+            </w:r>
+          </w:p>
+        </w:tc>
+        <w:tc>
+          <w:tcPr>
+            <w:tcW w:type="dxa" w:w="2160"/>
+          </w:tcPr>
+          <w:p>
+            <w:r>
+              <w:t>https://fonts.google.com/specimen/Caveat</w:t>
+            </w:r>
+          </w:p>
+        </w:tc>
+      </w:tr>
+    </w:tbl>
+    <w:p/>
+    <w:p>
+      <w:pPr>
+        <w:pStyle w:val="Heading3"/>
+      </w:pPr>
+      <w:r>
+        <w:t>Data Sources</w:t>
+      </w:r>
+    </w:p>
+    <w:p/>
+    <w:tbl>
+      <w:tblPr>
+        <w:tblStyle w:val="TableGrid"/>
+        <w:tblW w:type="auto" w:w="0"/>
+        <w:tblLook w:firstColumn="1" w:firstRow="1" w:lastColumn="0" w:lastRow="0" w:noHBand="0" w:noVBand="1" w:val="04A0"/>
+      </w:tblPr>
+      <w:tblGrid>
+        <w:gridCol w:w="2160"/>
+        <w:gridCol w:w="2160"/>
+        <w:gridCol w:w="2160"/>
+        <w:gridCol w:w="2160"/>
+      </w:tblGrid>
+      <w:tr>
+        <w:tc>
+          <w:tcPr>
+            <w:tcW w:type="dxa" w:w="2160"/>
+          </w:tcPr>
+          <w:p>
+            <w:r>
+              <w:t>#</w:t>
+            </w:r>
+          </w:p>
+        </w:tc>
+        <w:tc>
+          <w:tcPr>
+            <w:tcW w:type="dxa" w:w="2160"/>
+          </w:tcPr>
+          <w:p>
+            <w:r>
+              <w:t>Item</w:t>
+            </w:r>
+          </w:p>
+        </w:tc>
+        <w:tc>
+          <w:tcPr>
+            <w:tcW w:type="dxa" w:w="2160"/>
+          </w:tcPr>
+          <w:p>
+            <w:r>
+              <w:t>Source</w:t>
+            </w:r>
+          </w:p>
+        </w:tc>
+        <w:tc>
+          <w:tcPr>
+            <w:tcW w:type="dxa" w:w="2160"/>
+          </w:tcPr>
+          <w:p>
+            <w:r>
+              <w:t>License</w:t>
+            </w:r>
+          </w:p>
+        </w:tc>
+      </w:tr>
+      <w:tr>
+        <w:tc>
+          <w:tcPr>
+            <w:tcW w:type="dxa" w:w="2160"/>
+          </w:tcPr>
+          <w:p>
+            <w:r>
+              <w:t>13</w:t>
+            </w:r>
+          </w:p>
+        </w:tc>
+        <w:tc>
+          <w:tcPr>
+            <w:tcW w:type="dxa" w:w="2160"/>
+          </w:tcPr>
+          <w:p>
+            <w:r>
+              <w:t>Knowledge base (50 women)</w:t>
+            </w:r>
+          </w:p>
+        </w:tc>
+        <w:tc>
+          <w:tcPr>
+            <w:tcW w:type="dxa" w:w="2160"/>
+          </w:tcPr>
+          <w:p>
+            <w:r>
+              <w:t>Wikipedia, Britannica, biographies</w:t>
+            </w:r>
+          </w:p>
+        </w:tc>
+        <w:tc>
+          <w:tcPr>
+            <w:tcW w:type="dxa" w:w="2160"/>
+          </w:tcPr>
+          <w:p>
+            <w:r>
+              <w:t>Public domain / Fair use</w:t>
+            </w:r>
+          </w:p>
+        </w:tc>
+      </w:tr>
+      <w:tr>
+        <w:tc>
+          <w:tcPr>
+            <w:tcW w:type="dxa" w:w="2160"/>
+          </w:tcPr>
+          <w:p>
+            <w:r>
+              <w:t>14</w:t>
+            </w:r>
+          </w:p>
+        </w:tc>
+        <w:tc>
+          <w:tcPr>
+            <w:tcW w:type="dxa" w:w="2160"/>
+          </w:tcPr>
+          <w:p>
+            <w:r>
+              <w:t>Historical achievements</w:t>
+            </w:r>
+          </w:p>
+        </w:tc>
+        <w:tc>
+          <w:tcPr>
+            <w:tcW w:type="dxa" w:w="2160"/>
+          </w:tcPr>
+          <w:p>
+            <w:r>
+              <w:t>Multiple verified sources per woman</w:t>
+            </w:r>
+          </w:p>
+        </w:tc>
+        <w:tc>
+          <w:tcPr>
+            <w:tcW w:type="dxa" w:w="2160"/>
+          </w:tcPr>
+          <w:p>
+            <w:r>
+              <w:t>Public domain</w:t>
+            </w:r>
+          </w:p>
+        </w:tc>
+      </w:tr>
+    </w:tbl>
+    <w:p/>
+    <w:p>
+      <w:r>
+        <w:t>[Full Evidence Log →](docs/EVIDENCE_LOG.md)</w:t>
+      </w:r>
+    </w:p>
+    <w:p/>
+    <w:p>
+      <w:r>
+        <w:t>──────────────────────────────────────────────────</w:t>
+      </w:r>
+    </w:p>
+    <w:p/>
+    <w:p>
+      <w:pPr>
+        <w:pStyle w:val="Heading2"/>
+      </w:pPr>
+      <w:r>
+        <w:t>Demo Fallback</w:t>
+      </w:r>
+    </w:p>
+    <w:p/>
+    <w:p>
+      <w:r>
+        <w:t>If the live demo is unavailable, see [Demo Fallback Documentation](docs/DEMO_FALLBACK.md) for:</w:t>
+      </w:r>
+    </w:p>
+    <w:p>
+      <w:pPr>
+        <w:pStyle w:val="ListBullet"/>
+      </w:pPr>
+      <w:r>
+        <w:t>Video walkthrough (60s)</w:t>
+      </w:r>
+    </w:p>
+    <w:p>
+      <w:pPr>
+        <w:pStyle w:val="ListBullet"/>
+      </w:pPr>
+      <w:r>
+        <w:t>Step-by-step screenshots of full user journey</w:t>
+      </w:r>
+    </w:p>
+    <w:p>
+      <w:pPr>
+        <w:pStyle w:val="ListBullet"/>
+      </w:pPr>
+      <w:r>
+        <w:t>Sample generated story</w:t>
+      </w:r>
+    </w:p>
+    <w:p/>
+    <w:p>
+      <w:r>
+        <w:t>──────────────────────────────────────────────────</w:t>
+      </w:r>
+    </w:p>
+    <w:p/>
+    <w:p>
+      <w:pPr>
+        <w:pStyle w:val="Heading2"/>
+      </w:pPr>
+      <w:r>
+        <w:t>Known Issues &amp; Next Steps</w:t>
+      </w:r>
+    </w:p>
+    <w:p/>
+    <w:p>
+      <w:pPr>
+        <w:pStyle w:val="Heading3"/>
+      </w:pPr>
+      <w:r>
+        <w:t>Known Issues</w:t>
+      </w:r>
+    </w:p>
+    <w:p/>
     <w:tbl>
       <w:tblPr>
         <w:tblStyle w:val="TableGrid"/>
@@ -1406,54 +3375,10 @@
         <w:tc>
           <w:tcPr>
             <w:tcW w:type="dxa" w:w="2880"/>
-            <w:shd w:fill="D9EAD3"/>
           </w:tcPr>
           <w:p>
             <w:r>
-              <w:rPr>
-                <w:b/>
-              </w:rPr>
-              <w:t>Document</w:t>
-            </w:r>
-          </w:p>
-        </w:tc>
-        <w:tc>
-          <w:tcPr>
-            <w:tcW w:type="dxa" w:w="2880"/>
-            <w:shd w:fill="D9EAD3"/>
-          </w:tcPr>
-          <w:p>
-            <w:r>
-              <w:rPr>
-                <w:b/>
-              </w:rPr>
-              <w:t>Description</w:t>
-            </w:r>
-          </w:p>
-        </w:tc>
-        <w:tc>
-          <w:tcPr>
-            <w:tcW w:type="dxa" w:w="2880"/>
-            <w:shd w:fill="D9EAD3"/>
-          </w:tcPr>
-          <w:p>
-            <w:r>
-              <w:rPr>
-                <w:b/>
-              </w:rPr>
-              <w:t>Location</w:t>
-            </w:r>
-          </w:p>
-        </w:tc>
-      </w:tr>
-      <w:tr>
-        <w:tc>
-          <w:tcPr>
-            <w:tcW w:type="dxa" w:w="2880"/>
-          </w:tcPr>
-          <w:p>
-            <w:r>
-              <w:t>Decision Log</w:t>
+              <w:t>Issue</w:t>
             </w:r>
           </w:p>
         </w:tc>
@@ -1463,7 +3388,7 @@
           </w:tcPr>
           <w:p>
             <w:r>
-              <w:t>15 key technical choices with tradeoffs</w:t>
+              <w:t>Workaround</w:t>
             </w:r>
           </w:p>
         </w:tc>
@@ -1473,224 +3398,6 @@
           </w:tcPr>
           <w:p>
             <w:r>
-              <w:t>docs/DECISION_LOG.md</w:t>
-            </w:r>
-          </w:p>
-        </w:tc>
-      </w:tr>
-      <w:tr>
-        <w:tc>
-          <w:tcPr>
-            <w:tcW w:type="dxa" w:w="2880"/>
-          </w:tcPr>
-          <w:p>
-            <w:r>
-              <w:t>Risk Log</w:t>
-            </w:r>
-          </w:p>
-        </w:tc>
-        <w:tc>
-          <w:tcPr>
-            <w:tcW w:type="dxa" w:w="2880"/>
-          </w:tcPr>
-          <w:p>
-            <w:r>
-              <w:t>8 issues identified and fixed</w:t>
-            </w:r>
-          </w:p>
-        </w:tc>
-        <w:tc>
-          <w:tcPr>
-            <w:tcW w:type="dxa" w:w="2880"/>
-          </w:tcPr>
-          <w:p>
-            <w:r>
-              <w:t>docs/RISK_LOG.md</w:t>
-            </w:r>
-          </w:p>
-        </w:tc>
-      </w:tr>
-      <w:tr>
-        <w:tc>
-          <w:tcPr>
-            <w:tcW w:type="dxa" w:w="2880"/>
-          </w:tcPr>
-          <w:p>
-            <w:r>
-              <w:t>Evidence Log</w:t>
-            </w:r>
-          </w:p>
-        </w:tc>
-        <w:tc>
-          <w:tcPr>
-            <w:tcW w:type="dxa" w:w="2880"/>
-          </w:tcPr>
-          <w:p>
-            <w:r>
-              <w:t>14 sources with licenses</w:t>
-            </w:r>
-          </w:p>
-        </w:tc>
-        <w:tc>
-          <w:tcPr>
-            <w:tcW w:type="dxa" w:w="2880"/>
-          </w:tcPr>
-          <w:p>
-            <w:r>
-              <w:t>docs/EVIDENCE_LOG.md</w:t>
-            </w:r>
-          </w:p>
-        </w:tc>
-      </w:tr>
-      <w:tr>
-        <w:tc>
-          <w:tcPr>
-            <w:tcW w:type="dxa" w:w="2880"/>
-          </w:tcPr>
-          <w:p>
-            <w:r>
-              <w:t>AI Trace Log</w:t>
-            </w:r>
-          </w:p>
-        </w:tc>
-        <w:tc>
-          <w:tcPr>
-            <w:tcW w:type="dxa" w:w="2880"/>
-          </w:tcPr>
-          <w:p>
-            <w:r>
-              <w:t>7 AI usage entries with verification</w:t>
-            </w:r>
-          </w:p>
-        </w:tc>
-        <w:tc>
-          <w:tcPr>
-            <w:tcW w:type="dxa" w:w="2880"/>
-          </w:tcPr>
-          <w:p>
-            <w:r>
-              <w:t>docs/AI_TRACE_LOG.md</w:t>
-            </w:r>
-          </w:p>
-        </w:tc>
-      </w:tr>
-      <w:tr>
-        <w:tc>
-          <w:tcPr>
-            <w:tcW w:type="dxa" w:w="2880"/>
-          </w:tcPr>
-          <w:p>
-            <w:r>
-              <w:t>Problem Frame</w:t>
-            </w:r>
-          </w:p>
-        </w:tc>
-        <w:tc>
-          <w:tcPr>
-            <w:tcW w:type="dxa" w:w="2880"/>
-          </w:tcPr>
-          <w:p>
-            <w:r>
-              <w:t>4-line problem definition</w:t>
-            </w:r>
-          </w:p>
-        </w:tc>
-        <w:tc>
-          <w:tcPr>
-            <w:tcW w:type="dxa" w:w="2880"/>
-          </w:tcPr>
-          <w:p>
-            <w:r>
-              <w:t>docs/PROBLEM_FRAME.md</w:t>
-            </w:r>
-          </w:p>
-        </w:tc>
-      </w:tr>
-    </w:tbl>
-    <w:p>
-      <w:pPr>
-        <w:pStyle w:val="Heading1"/>
-      </w:pPr>
-      <w:r>
-        <w:t>Testing &amp; Known Issues</w:t>
-      </w:r>
-    </w:p>
-    <w:p>
-      <w:pPr>
-        <w:pStyle w:val="Heading2"/>
-      </w:pPr>
-      <w:r>
-        <w:t>Test Results</w:t>
-      </w:r>
-    </w:p>
-    <w:p>
-      <w:r>
-        <w:t>Backend (pytest): 151 tests (unit + integration)</w:t>
-      </w:r>
-    </w:p>
-    <w:p>
-      <w:r>
-        <w:t>Frontend (Jest): 24 passed, 25 skipped (SSE mocking complexity)</w:t>
-      </w:r>
-    </w:p>
-    <w:p>
-      <w:pPr>
-        <w:pStyle w:val="Heading2"/>
-      </w:pPr>
-      <w:r>
-        <w:t>Known Issues</w:t>
-      </w:r>
-    </w:p>
-    <w:tbl>
-      <w:tblPr>
-        <w:tblStyle w:val="TableGrid"/>
-        <w:tblW w:type="auto" w:w="0"/>
-        <w:tblLook w:firstColumn="1" w:firstRow="1" w:lastColumn="0" w:lastRow="0" w:noHBand="0" w:noVBand="1" w:val="04A0"/>
-      </w:tblPr>
-      <w:tblGrid>
-        <w:gridCol w:w="2880"/>
-        <w:gridCol w:w="2880"/>
-        <w:gridCol w:w="2880"/>
-      </w:tblGrid>
-      <w:tr>
-        <w:tc>
-          <w:tcPr>
-            <w:tcW w:type="dxa" w:w="2880"/>
-            <w:shd w:fill="D9EAD3"/>
-          </w:tcPr>
-          <w:p>
-            <w:r>
-              <w:rPr>
-                <w:b/>
-              </w:rPr>
-              <w:t>Issue</w:t>
-            </w:r>
-          </w:p>
-        </w:tc>
-        <w:tc>
-          <w:tcPr>
-            <w:tcW w:type="dxa" w:w="2880"/>
-            <w:shd w:fill="D9EAD3"/>
-          </w:tcPr>
-          <w:p>
-            <w:r>
-              <w:rPr>
-                <w:b/>
-              </w:rPr>
-              <w:t>Workaround</w:t>
-            </w:r>
-          </w:p>
-        </w:tc>
-        <w:tc>
-          <w:tcPr>
-            <w:tcW w:type="dxa" w:w="2880"/>
-            <w:shd w:fill="D9EAD3"/>
-          </w:tcPr>
-          <w:p>
-            <w:r>
-              <w:rPr>
-                <w:b/>
-              </w:rPr>
               <w:t>Status</w:t>
             </w:r>
           </w:p>
@@ -1713,7 +3420,7 @@
           </w:tcPr>
           <w:p>
             <w:r>
-              <w:t>Acceptable for demo; would need storage for production</w:t>
+              <w:t>Acceptable for demo; would need image storage</w:t>
             </w:r>
           </w:p>
         </w:tc>
@@ -1745,7 +3452,7 @@
           </w:tcPr>
           <w:p>
             <w:r>
-              <w:t>Integration tests with real backend recommended</w:t>
+              <w:t>Complex to mock; integration tests recommended</w:t>
             </w:r>
           </w:p>
         </w:tc>
@@ -1767,7 +3474,7 @@
           </w:tcPr>
           <w:p>
             <w:r>
-              <w:t>Generation time ~75-90s</w:t>
+              <w:t>Generation time ~35-75s</w:t>
             </w:r>
           </w:p>
         </w:tc>
@@ -1793,17 +3500,112 @@
         </w:tc>
       </w:tr>
     </w:tbl>
+    <w:p/>
     <w:p>
       <w:pPr>
-        <w:pStyle w:val="Heading1"/>
+        <w:pStyle w:val="Heading3"/>
       </w:pPr>
       <w:r>
-        <w:t>License &amp; Attributions</w:t>
+        <w:t>Next Steps</w:t>
+      </w:r>
+    </w:p>
+    <w:p/>
+    <w:p>
+      <w:pPr>
+        <w:pStyle w:val="ListBullet"/>
+      </w:pPr>
+      <w:r>
+        <w:t>[ ] Image persistence (S3/Cloudinary)</w:t>
       </w:r>
     </w:p>
     <w:p>
       <w:pPr>
+        <w:pStyle w:val="ListBullet"/>
+      </w:pPr>
+      <w:r>
+        <w:t>[ ] Multi-language support</w:t>
+      </w:r>
+    </w:p>
+    <w:p>
+      <w:pPr>
+        <w:pStyle w:val="ListBullet"/>
+      </w:pPr>
+      <w:r>
+        <w:t>[ ] PDF export</w:t>
+      </w:r>
+    </w:p>
+    <w:p>
+      <w:pPr>
+        <w:pStyle w:val="ListBullet"/>
+      </w:pPr>
+      <w:r>
+        <w:t>[ ] Parent dashboard</w:t>
+      </w:r>
+    </w:p>
+    <w:p>
+      <w:pPr>
+        <w:pStyle w:val="ListBullet"/>
+      </w:pPr>
+      <w:r>
+        <w:t>[ ] More women in knowledge base</w:t>
+      </w:r>
+    </w:p>
+    <w:p/>
+    <w:p>
+      <w:r>
+        <w:t>──────────────────────────────────────────────────</w:t>
+      </w:r>
+    </w:p>
+    <w:p/>
+    <w:p>
+      <w:pPr>
         <w:pStyle w:val="Heading2"/>
+      </w:pPr>
+      <w:r>
+        <w:t>Testing</w:t>
+      </w:r>
+    </w:p>
+    <w:p/>
+    <w:p>
+      <w:pPr/>
+      <w:r>
+        <w:rPr>
+          <w:rFonts w:ascii="Courier New" w:hAnsi="Courier New"/>
+          <w:sz w:val="18"/>
+        </w:rPr>
+        <w:t># Backend (pytest)</w:t>
+        <w:br/>
+        <w:t>cd backend &amp;&amp; pytest tests/ -v</w:t>
+        <w:br/>
+        <w:t># 151 tests (unit + integration)</w:t>
+        <w:br/>
+        <w:br/>
+        <w:t># Frontend (Jest)</w:t>
+        <w:br/>
+        <w:t>cd frontend &amp;&amp; npm test</w:t>
+        <w:br/>
+        <w:t># 24 passed, 25 skipped</w:t>
+      </w:r>
+    </w:p>
+    <w:p/>
+    <w:p>
+      <w:r>
+        <w:t>──────────────────────────────────────────────────</w:t>
+      </w:r>
+    </w:p>
+    <w:p/>
+    <w:p>
+      <w:pPr>
+        <w:pStyle w:val="Heading2"/>
+      </w:pPr>
+      <w:r>
+        <w:t>License</w:t>
+      </w:r>
+    </w:p>
+    <w:p/>
+    <w:p>
+      <w:pPr>
+        <w:pStyle w:val="Heading3"/>
       </w:pPr>
       <w:r>
         <w:t>Project License</w:t>
@@ -1811,17 +3613,19 @@
     </w:p>
     <w:p>
       <w:r>
-        <w:t>MIT License</w:t>
+        <w:t>MIT License — See [LICENSE](LICENSE)</w:t>
       </w:r>
     </w:p>
+    <w:p/>
     <w:p>
       <w:pPr>
-        <w:pStyle w:val="Heading2"/>
+        <w:pStyle w:val="Heading3"/>
       </w:pPr>
       <w:r>
-        <w:t>Dependencies</w:t>
+        <w:t>Attributions</w:t>
       </w:r>
     </w:p>
+    <w:p/>
     <w:tbl>
       <w:tblPr>
         <w:tblStyle w:val="TableGrid"/>
@@ -1837,13 +3641,9 @@
         <w:tc>
           <w:tcPr>
             <w:tcW w:type="dxa" w:w="2880"/>
-            <w:shd w:fill="D9EAD3"/>
           </w:tcPr>
           <w:p>
             <w:r>
-              <w:rPr>
-                <w:b/>
-              </w:rPr>
               <w:t>Package</w:t>
             </w:r>
           </w:p>
@@ -1851,13 +3651,9 @@
         <w:tc>
           <w:tcPr>
             <w:tcW w:type="dxa" w:w="2880"/>
-            <w:shd w:fill="D9EAD3"/>
           </w:tcPr>
           <w:p>
             <w:r>
-              <w:rPr>
-                <w:b/>
-              </w:rPr>
               <w:t>License</w:t>
             </w:r>
           </w:p>
@@ -1865,13 +3661,9 @@
         <w:tc>
           <w:tcPr>
             <w:tcW w:type="dxa" w:w="2880"/>
-            <w:shd w:fill="D9EAD3"/>
           </w:tcPr>
           <w:p>
             <w:r>
-              <w:rPr>
-                <w:b/>
-              </w:rPr>
               <w:t>Link</w:t>
             </w:r>
           </w:p>
@@ -2101,13 +3893,58 @@
           </w:p>
         </w:tc>
       </w:tr>
+      <w:tr>
+        <w:tc>
+          <w:tcPr>
+            <w:tcW w:type="dxa" w:w="2880"/>
+          </w:tcPr>
+          <w:p>
+            <w:r>
+              <w:t>Caveat Font</w:t>
+            </w:r>
+          </w:p>
+        </w:tc>
+        <w:tc>
+          <w:tcPr>
+            <w:tcW w:type="dxa" w:w="2880"/>
+          </w:tcPr>
+          <w:p>
+            <w:r>
+              <w:t>SIL OFL</w:t>
+            </w:r>
+          </w:p>
+        </w:tc>
+        <w:tc>
+          <w:tcPr>
+            <w:tcW w:type="dxa" w:w="2880"/>
+          </w:tcPr>
+          <w:p>
+            <w:r>
+              <w:t>https://fonts.google.com/specimen/Caveat</w:t>
+            </w:r>
+          </w:p>
+        </w:tc>
+      </w:tr>
     </w:tbl>
+    <w:p/>
+    <w:p>
+      <w:r>
+        <w:t>All licenses are permissive and compatible with commercial use.</w:t>
+      </w:r>
+    </w:p>
+    <w:p/>
+    <w:p>
+      <w:r>
+        <w:t>──────────────────────────────────────────────────</w:t>
+      </w:r>
+    </w:p>
     <w:p/>
     <w:p>
       <w:r>
         <w:t>Built with love for #75HER Challenge | CreateHER Fest 2026</w:t>
       </w:r>
     </w:p>
+    <w:p/>
     <w:sectPr>
       <w:pgSz w:w="12240" w:h="15840"/>
       <w:pgMar w:top="1440" w:right="1800" w:bottom="1440" w:left="1800" w:header="720" w:footer="720" w:gutter="0"/>
@@ -2481,6 +4318,10 @@
     <w:name w:val="Normal"/>
     <w:qFormat/>
     <w:rsid w:val="00FC693F"/>
+    <w:rPr>
+      <w:rFonts w:ascii="Calibri" w:hAnsi="Calibri"/>
+      <w:sz w:val="22"/>
+    </w:rPr>
   </w:style>
   <w:style w:type="paragraph" w:styleId="Header">
     <w:name w:val="header"/>

</xml_diff>